<commit_message>
Update Assessment 2 Identify and resolve client problems
</commit_message>
<xml_diff>
--- a/ICT/Identify and resolve client ICT problems/Assessment 2/ICT40120_Emerging_ICT_Tech_AT2.docx
+++ b/ICT/Identify and resolve client ICT problems/Assessment 2/ICT40120_Emerging_ICT_Tech_AT2.docx
@@ -2056,7 +2056,6 @@
                 <w:szCs w:val="20"/>
               </w:rPr>
             </w:pPr>
-            <w:bookmarkStart w:id="0" w:name="_GoBack"/>
             <w:r>
               <w:rPr>
                 <w:rFonts w:eastAsia="Times New Roman"/>
@@ -2220,7 +2219,6 @@
               <w:t>Your own idea - please see your teacher to obtain permission.</w:t>
             </w:r>
           </w:p>
-          <w:bookmarkEnd w:id="0"/>
           <w:p>
             <w:pPr>
               <w:pStyle w:val="BodyA"/>
@@ -14275,6 +14273,33 @@
           </w:p>
         </w:tc>
       </w:tr>
+    </w:tbl>
+    <w:p>
+      <w:r>
+        <w:br w:type="page"/>
+      </w:r>
+    </w:p>
+    <w:tbl>
+      <w:tblPr>
+        <w:tblW w:w="10632" w:type="dxa"/>
+        <w:tblInd w:w="-5" w:type="dxa"/>
+        <w:tblBorders>
+          <w:top w:val="single" w:sz="4" w:space="0" w:color="7F7F7F"/>
+          <w:left w:val="single" w:sz="4" w:space="0" w:color="7F7F7F"/>
+          <w:bottom w:val="single" w:sz="4" w:space="0" w:color="7F7F7F"/>
+          <w:right w:val="single" w:sz="4" w:space="0" w:color="7F7F7F"/>
+          <w:insideH w:val="single" w:sz="4" w:space="0" w:color="7F7F7F"/>
+          <w:insideV w:val="single" w:sz="4" w:space="0" w:color="7F7F7F"/>
+        </w:tblBorders>
+        <w:tblLayout w:type="fixed"/>
+        <w:tblLook w:val="04A0" w:firstRow="1" w:lastRow="0" w:firstColumn="1" w:lastColumn="0" w:noHBand="0" w:noVBand="1"/>
+      </w:tblPr>
+      <w:tblGrid>
+        <w:gridCol w:w="1418"/>
+        <w:gridCol w:w="6549"/>
+        <w:gridCol w:w="1378"/>
+        <w:gridCol w:w="1287"/>
+      </w:tblGrid>
       <w:tr>
         <w:trPr>
           <w:trHeight w:val="416"/>
@@ -14282,7 +14307,7 @@
         <w:tc>
           <w:tcPr>
             <w:tcW w:w="7967" w:type="dxa"/>
-            <w:gridSpan w:val="6"/>
+            <w:gridSpan w:val="2"/>
             <w:shd w:val="clear" w:color="auto" w:fill="auto"/>
           </w:tcPr>
           <w:p>
@@ -14302,21 +14327,790 @@
                 <w:color w:val="000000"/>
                 <w:szCs w:val="20"/>
               </w:rPr>
+              <w:lastRenderedPageBreak/>
               <w:t>Answer:</w:t>
             </w:r>
           </w:p>
           <w:p>
             <w:pPr>
-              <w:tabs>
-                <w:tab w:val="center" w:pos="3883"/>
-              </w:tabs>
               <w:spacing w:before="60" w:after="60"/>
               <w:rPr>
                 <w:rFonts w:cs="Arial"/>
-                <w:color w:val="000000"/>
-                <w:szCs w:val="20"/>
-              </w:rPr>
-            </w:pPr>
+                <w:b/>
+                <w:color w:val="000000"/>
+                <w:szCs w:val="20"/>
+              </w:rPr>
+            </w:pPr>
+            <w:r>
+              <w:rPr>
+                <w:rFonts w:cs="Arial"/>
+                <w:b/>
+                <w:color w:val="000000"/>
+                <w:szCs w:val="20"/>
+              </w:rPr>
+              <w:t>Mood Board:</w:t>
+            </w:r>
+          </w:p>
+          <w:p>
+            <w:pPr>
+              <w:spacing w:before="60" w:after="60"/>
+              <w:rPr>
+                <w:rFonts w:cs="Arial"/>
+                <w:b/>
+                <w:color w:val="000000"/>
+                <w:szCs w:val="20"/>
+              </w:rPr>
+            </w:pPr>
+            <w:r>
+              <w:rPr>
+                <w:rFonts w:cs="Arial"/>
+                <w:b/>
+                <w:noProof/>
+                <w:color w:val="000000"/>
+                <w:szCs w:val="20"/>
+              </w:rPr>
+              <w:drawing>
+                <wp:inline distT="0" distB="0" distL="0" distR="0" wp14:anchorId="272D2EFB" wp14:editId="56E8DA60">
+                  <wp:extent cx="4921885" cy="3599180"/>
+                  <wp:effectExtent l="0" t="0" r="0" b="1270"/>
+                  <wp:docPr id="5" name="Picture 5"/>
+                  <wp:cNvGraphicFramePr>
+                    <a:graphicFrameLocks xmlns:a="http://schemas.openxmlformats.org/drawingml/2006/main" noChangeAspect="1"/>
+                  </wp:cNvGraphicFramePr>
+                  <a:graphic xmlns:a="http://schemas.openxmlformats.org/drawingml/2006/main">
+                    <a:graphicData uri="http://schemas.openxmlformats.org/drawingml/2006/picture">
+                      <pic:pic xmlns:pic="http://schemas.openxmlformats.org/drawingml/2006/picture">
+                        <pic:nvPicPr>
+                          <pic:cNvPr id="5" name="StyleTitle.png"/>
+                          <pic:cNvPicPr/>
+                        </pic:nvPicPr>
+                        <pic:blipFill>
+                          <a:blip r:embed="rId17" cstate="print">
+                            <a:extLst>
+                              <a:ext uri="{28A0092B-C50C-407E-A947-70E740481C1C}">
+                                <a14:useLocalDpi xmlns:a14="http://schemas.microsoft.com/office/drawing/2010/main" val="0"/>
+                              </a:ext>
+                            </a:extLst>
+                          </a:blip>
+                          <a:stretch>
+                            <a:fillRect/>
+                          </a:stretch>
+                        </pic:blipFill>
+                        <pic:spPr>
+                          <a:xfrm>
+                            <a:off x="0" y="0"/>
+                            <a:ext cx="4921885" cy="3599180"/>
+                          </a:xfrm>
+                          <a:prstGeom prst="rect">
+                            <a:avLst/>
+                          </a:prstGeom>
+                        </pic:spPr>
+                      </pic:pic>
+                    </a:graphicData>
+                  </a:graphic>
+                </wp:inline>
+              </w:drawing>
+            </w:r>
+          </w:p>
+          <w:p>
+            <w:pPr>
+              <w:spacing w:before="60" w:after="60"/>
+              <w:rPr>
+                <w:rFonts w:cs="Arial"/>
+                <w:b/>
+                <w:color w:val="000000"/>
+                <w:szCs w:val="20"/>
+              </w:rPr>
+            </w:pPr>
+            <w:r>
+              <w:rPr>
+                <w:rFonts w:cs="Arial"/>
+                <w:b/>
+                <w:color w:val="000000"/>
+                <w:szCs w:val="20"/>
+              </w:rPr>
+              <w:t xml:space="preserve">URL: </w:t>
+            </w:r>
+            <w:hyperlink r:id="rId18" w:history="1">
+              <w:r>
+                <w:rPr>
+                  <w:rStyle w:val="Hyperlink"/>
+                  <w:rFonts w:cs="Arial"/>
+                  <w:b/>
+                  <w:szCs w:val="20"/>
+                </w:rPr>
+                <w:t>https://www.figma.com/design/TqG4vt9RHHg5zwC6tXwraD/Assessment-2---Identify-and-Resolve-Client-ICT-Problems?m=auto&amp;t=LrhUNoEvIK8fCOzD-6</w:t>
+              </w:r>
+            </w:hyperlink>
+          </w:p>
+          <w:p>
+            <w:pPr>
+              <w:spacing w:before="60" w:after="60"/>
+              <w:rPr>
+                <w:rFonts w:cs="Arial"/>
+                <w:b/>
+                <w:color w:val="000000"/>
+                <w:szCs w:val="20"/>
+              </w:rPr>
+            </w:pPr>
+          </w:p>
+          <w:p>
+            <w:pPr>
+              <w:spacing w:before="60" w:after="60"/>
+              <w:rPr>
+                <w:rFonts w:cs="Arial"/>
+                <w:b/>
+                <w:color w:val="000000"/>
+                <w:szCs w:val="20"/>
+              </w:rPr>
+            </w:pPr>
+            <w:r>
+              <w:rPr>
+                <w:rFonts w:cs="Arial"/>
+                <w:b/>
+                <w:color w:val="000000"/>
+                <w:szCs w:val="20"/>
+              </w:rPr>
+              <w:t>Sitemap:</w:t>
+            </w:r>
+          </w:p>
+          <w:p>
+            <w:pPr>
+              <w:spacing w:before="60" w:after="60"/>
+              <w:rPr>
+                <w:rFonts w:cs="Arial"/>
+                <w:b/>
+                <w:color w:val="000000"/>
+                <w:szCs w:val="20"/>
+              </w:rPr>
+            </w:pPr>
+            <w:r>
+              <w:rPr>
+                <w:rFonts w:cs="Arial"/>
+                <w:b/>
+                <w:noProof/>
+                <w:color w:val="000000"/>
+                <w:szCs w:val="20"/>
+              </w:rPr>
+              <w:drawing>
+                <wp:inline distT="0" distB="0" distL="0" distR="0" wp14:anchorId="21B6E2A1" wp14:editId="0B26D395">
+                  <wp:extent cx="4921885" cy="3007995"/>
+                  <wp:effectExtent l="0" t="0" r="0" b="1905"/>
+                  <wp:docPr id="1" name="Picture 1"/>
+                  <wp:cNvGraphicFramePr>
+                    <a:graphicFrameLocks xmlns:a="http://schemas.openxmlformats.org/drawingml/2006/main" noChangeAspect="1"/>
+                  </wp:cNvGraphicFramePr>
+                  <a:graphic xmlns:a="http://schemas.openxmlformats.org/drawingml/2006/main">
+                    <a:graphicData uri="http://schemas.openxmlformats.org/drawingml/2006/picture">
+                      <pic:pic xmlns:pic="http://schemas.openxmlformats.org/drawingml/2006/picture">
+                        <pic:nvPicPr>
+                          <pic:cNvPr id="1" name="EVORide Sitemap.png"/>
+                          <pic:cNvPicPr/>
+                        </pic:nvPicPr>
+                        <pic:blipFill>
+                          <a:blip r:embed="rId19" cstate="print">
+                            <a:extLst>
+                              <a:ext uri="{28A0092B-C50C-407E-A947-70E740481C1C}">
+                                <a14:useLocalDpi xmlns:a14="http://schemas.microsoft.com/office/drawing/2010/main" val="0"/>
+                              </a:ext>
+                            </a:extLst>
+                          </a:blip>
+                          <a:stretch>
+                            <a:fillRect/>
+                          </a:stretch>
+                        </pic:blipFill>
+                        <pic:spPr>
+                          <a:xfrm>
+                            <a:off x="0" y="0"/>
+                            <a:ext cx="4921885" cy="3007995"/>
+                          </a:xfrm>
+                          <a:prstGeom prst="rect">
+                            <a:avLst/>
+                          </a:prstGeom>
+                        </pic:spPr>
+                      </pic:pic>
+                    </a:graphicData>
+                  </a:graphic>
+                </wp:inline>
+              </w:drawing>
+            </w:r>
+          </w:p>
+          <w:p>
+            <w:pPr>
+              <w:spacing w:before="60" w:after="60"/>
+              <w:rPr>
+                <w:rFonts w:cs="Arial"/>
+                <w:b/>
+                <w:color w:val="000000"/>
+                <w:szCs w:val="20"/>
+              </w:rPr>
+            </w:pPr>
+            <w:r>
+              <w:rPr>
+                <w:rFonts w:cs="Arial"/>
+                <w:b/>
+                <w:color w:val="000000"/>
+                <w:szCs w:val="20"/>
+              </w:rPr>
+              <w:t xml:space="preserve">URL: </w:t>
+            </w:r>
+            <w:hyperlink r:id="rId20" w:history="1">
+              <w:r>
+                <w:rPr>
+                  <w:rStyle w:val="Hyperlink"/>
+                  <w:rFonts w:cs="Arial"/>
+                  <w:b/>
+                  <w:szCs w:val="20"/>
+                </w:rPr>
+                <w:t>https://www.figma.com/board/iktz28wkJkCqJzg89i5eFF/Evoride-Sitemap?t=LrhUNoEvIK8fCOzD-6</w:t>
+              </w:r>
+            </w:hyperlink>
+          </w:p>
+          <w:p>
+            <w:pPr>
+              <w:spacing w:before="60" w:after="60"/>
+              <w:rPr>
+                <w:rFonts w:cs="Arial"/>
+                <w:b/>
+                <w:color w:val="000000"/>
+                <w:szCs w:val="20"/>
+              </w:rPr>
+            </w:pPr>
+            <w:proofErr w:type="spellStart"/>
+            <w:r>
+              <w:rPr>
+                <w:rFonts w:cs="Arial"/>
+                <w:b/>
+                <w:color w:val="000000"/>
+                <w:szCs w:val="20"/>
+              </w:rPr>
+              <w:lastRenderedPageBreak/>
+              <w:t>WireFrame</w:t>
+            </w:r>
+            <w:proofErr w:type="spellEnd"/>
+          </w:p>
+          <w:p>
+            <w:pPr>
+              <w:spacing w:before="60" w:after="60"/>
+              <w:rPr>
+                <w:rFonts w:cs="Arial"/>
+                <w:b/>
+                <w:color w:val="000000"/>
+                <w:szCs w:val="20"/>
+              </w:rPr>
+            </w:pPr>
+            <w:r>
+              <w:rPr>
+                <w:rFonts w:cs="Arial"/>
+                <w:b/>
+                <w:color w:val="000000"/>
+                <w:szCs w:val="20"/>
+              </w:rPr>
+              <w:t xml:space="preserve">URL: </w:t>
+            </w:r>
+            <w:hyperlink r:id="rId21" w:history="1">
+              <w:r>
+                <w:rPr>
+                  <w:rStyle w:val="Hyperlink"/>
+                  <w:rFonts w:cs="Arial"/>
+                  <w:b/>
+                  <w:szCs w:val="20"/>
+                </w:rPr>
+                <w:t>https://www.figma.com/design/TqG4vt9RHHg5zwC6tXwraD/Assessment-2---Identify-and-Resolve-Client-ICT-Problems?m=auto&amp;t=LrhUNoEvIK8fCOzD-6</w:t>
+              </w:r>
+            </w:hyperlink>
+          </w:p>
+          <w:p>
+            <w:pPr>
+              <w:spacing w:before="60" w:after="60"/>
+              <w:rPr>
+                <w:rFonts w:cs="Arial"/>
+                <w:b/>
+                <w:color w:val="000000"/>
+                <w:szCs w:val="20"/>
+              </w:rPr>
+            </w:pPr>
+            <w:r>
+              <w:rPr>
+                <w:rFonts w:cs="Arial"/>
+                <w:b/>
+                <w:color w:val="000000"/>
+                <w:szCs w:val="20"/>
+              </w:rPr>
+              <w:t>Homepage</w:t>
+            </w:r>
+          </w:p>
+          <w:p>
+            <w:pPr>
+              <w:spacing w:before="60" w:after="60"/>
+              <w:jc w:val="center"/>
+              <w:rPr>
+                <w:rFonts w:cs="Arial"/>
+                <w:b/>
+                <w:color w:val="000000"/>
+                <w:szCs w:val="20"/>
+              </w:rPr>
+            </w:pPr>
+            <w:r>
+              <w:rPr>
+                <w:rFonts w:cs="Arial"/>
+                <w:b/>
+                <w:noProof/>
+                <w:color w:val="000000"/>
+                <w:szCs w:val="20"/>
+              </w:rPr>
+              <w:drawing>
+                <wp:inline distT="0" distB="0" distL="0" distR="0" wp14:anchorId="315E1F7A" wp14:editId="76E5FDD2">
+                  <wp:extent cx="3178903" cy="6806260"/>
+                  <wp:effectExtent l="0" t="0" r="2540" b="0"/>
+                  <wp:docPr id="6" name="Picture 6"/>
+                  <wp:cNvGraphicFramePr>
+                    <a:graphicFrameLocks xmlns:a="http://schemas.openxmlformats.org/drawingml/2006/main" noChangeAspect="1"/>
+                  </wp:cNvGraphicFramePr>
+                  <a:graphic xmlns:a="http://schemas.openxmlformats.org/drawingml/2006/main">
+                    <a:graphicData uri="http://schemas.openxmlformats.org/drawingml/2006/picture">
+                      <pic:pic xmlns:pic="http://schemas.openxmlformats.org/drawingml/2006/picture">
+                        <pic:nvPicPr>
+                          <pic:cNvPr id="6" name="WireFrameHomepage.png"/>
+                          <pic:cNvPicPr/>
+                        </pic:nvPicPr>
+                        <pic:blipFill>
+                          <a:blip r:embed="rId22" cstate="print">
+                            <a:extLst>
+                              <a:ext uri="{28A0092B-C50C-407E-A947-70E740481C1C}">
+                                <a14:useLocalDpi xmlns:a14="http://schemas.microsoft.com/office/drawing/2010/main" val="0"/>
+                              </a:ext>
+                            </a:extLst>
+                          </a:blip>
+                          <a:stretch>
+                            <a:fillRect/>
+                          </a:stretch>
+                        </pic:blipFill>
+                        <pic:spPr>
+                          <a:xfrm>
+                            <a:off x="0" y="0"/>
+                            <a:ext cx="3187541" cy="6824755"/>
+                          </a:xfrm>
+                          <a:prstGeom prst="rect">
+                            <a:avLst/>
+                          </a:prstGeom>
+                        </pic:spPr>
+                      </pic:pic>
+                    </a:graphicData>
+                  </a:graphic>
+                </wp:inline>
+              </w:drawing>
+            </w:r>
+          </w:p>
+          <w:p>
+            <w:pPr>
+              <w:spacing w:before="60" w:after="60"/>
+              <w:rPr>
+                <w:rFonts w:cs="Arial"/>
+                <w:b/>
+                <w:color w:val="000000"/>
+                <w:szCs w:val="20"/>
+              </w:rPr>
+            </w:pPr>
+            <w:r>
+              <w:rPr>
+                <w:rFonts w:cs="Arial"/>
+                <w:b/>
+                <w:color w:val="000000"/>
+                <w:szCs w:val="20"/>
+              </w:rPr>
+              <w:br/>
+              <w:t>Vehicles page:</w:t>
+            </w:r>
+          </w:p>
+          <w:p>
+            <w:pPr>
+              <w:spacing w:before="60" w:after="60"/>
+              <w:jc w:val="center"/>
+              <w:rPr>
+                <w:rFonts w:cs="Arial"/>
+                <w:b/>
+                <w:color w:val="000000"/>
+                <w:szCs w:val="20"/>
+              </w:rPr>
+            </w:pPr>
+            <w:r>
+              <w:rPr>
+                <w:rFonts w:cs="Arial"/>
+                <w:b/>
+                <w:noProof/>
+                <w:color w:val="000000"/>
+                <w:szCs w:val="20"/>
+              </w:rPr>
+              <w:lastRenderedPageBreak/>
+              <w:drawing>
+                <wp:inline distT="0" distB="0" distL="0" distR="0" wp14:anchorId="77D1DAE9" wp14:editId="31F6FB53">
+                  <wp:extent cx="2884473" cy="8583284"/>
+                  <wp:effectExtent l="0" t="0" r="0" b="8890"/>
+                  <wp:docPr id="9" name="Picture 9"/>
+                  <wp:cNvGraphicFramePr>
+                    <a:graphicFrameLocks xmlns:a="http://schemas.openxmlformats.org/drawingml/2006/main" noChangeAspect="1"/>
+                  </wp:cNvGraphicFramePr>
+                  <a:graphic xmlns:a="http://schemas.openxmlformats.org/drawingml/2006/main">
+                    <a:graphicData uri="http://schemas.openxmlformats.org/drawingml/2006/picture">
+                      <pic:pic xmlns:pic="http://schemas.openxmlformats.org/drawingml/2006/picture">
+                        <pic:nvPicPr>
+                          <pic:cNvPr id="9" name="WireFrameVehicles.png"/>
+                          <pic:cNvPicPr/>
+                        </pic:nvPicPr>
+                        <pic:blipFill>
+                          <a:blip r:embed="rId23" cstate="print">
+                            <a:extLst>
+                              <a:ext uri="{28A0092B-C50C-407E-A947-70E740481C1C}">
+                                <a14:useLocalDpi xmlns:a14="http://schemas.microsoft.com/office/drawing/2010/main" val="0"/>
+                              </a:ext>
+                            </a:extLst>
+                          </a:blip>
+                          <a:stretch>
+                            <a:fillRect/>
+                          </a:stretch>
+                        </pic:blipFill>
+                        <pic:spPr>
+                          <a:xfrm>
+                            <a:off x="0" y="0"/>
+                            <a:ext cx="2890394" cy="8600902"/>
+                          </a:xfrm>
+                          <a:prstGeom prst="rect">
+                            <a:avLst/>
+                          </a:prstGeom>
+                        </pic:spPr>
+                      </pic:pic>
+                    </a:graphicData>
+                  </a:graphic>
+                </wp:inline>
+              </w:drawing>
+            </w:r>
+          </w:p>
+          <w:p>
+            <w:pPr>
+              <w:spacing w:before="60" w:after="60"/>
+              <w:rPr>
+                <w:rFonts w:cs="Arial"/>
+                <w:b/>
+                <w:color w:val="000000"/>
+                <w:szCs w:val="20"/>
+              </w:rPr>
+            </w:pPr>
+            <w:r>
+              <w:rPr>
+                <w:rFonts w:cs="Arial"/>
+                <w:b/>
+                <w:color w:val="000000"/>
+                <w:szCs w:val="20"/>
+              </w:rPr>
+              <w:lastRenderedPageBreak/>
+              <w:t>About Us page</w:t>
+            </w:r>
+          </w:p>
+          <w:p>
+            <w:pPr>
+              <w:spacing w:before="60" w:after="60"/>
+              <w:rPr>
+                <w:rFonts w:cs="Arial"/>
+                <w:b/>
+                <w:color w:val="000000"/>
+                <w:szCs w:val="20"/>
+              </w:rPr>
+            </w:pPr>
+            <w:r>
+              <w:rPr>
+                <w:rFonts w:cs="Arial"/>
+                <w:b/>
+                <w:noProof/>
+                <w:color w:val="000000"/>
+                <w:szCs w:val="20"/>
+              </w:rPr>
+              <w:drawing>
+                <wp:inline distT="0" distB="0" distL="0" distR="0" wp14:anchorId="2FB949C8" wp14:editId="18B44FF6">
+                  <wp:extent cx="4513479" cy="7892037"/>
+                  <wp:effectExtent l="0" t="0" r="1905" b="0"/>
+                  <wp:docPr id="10" name="Picture 10"/>
+                  <wp:cNvGraphicFramePr>
+                    <a:graphicFrameLocks xmlns:a="http://schemas.openxmlformats.org/drawingml/2006/main" noChangeAspect="1"/>
+                  </wp:cNvGraphicFramePr>
+                  <a:graphic xmlns:a="http://schemas.openxmlformats.org/drawingml/2006/main">
+                    <a:graphicData uri="http://schemas.openxmlformats.org/drawingml/2006/picture">
+                      <pic:pic xmlns:pic="http://schemas.openxmlformats.org/drawingml/2006/picture">
+                        <pic:nvPicPr>
+                          <pic:cNvPr id="10" name="WireFrameAboutUs.png"/>
+                          <pic:cNvPicPr/>
+                        </pic:nvPicPr>
+                        <pic:blipFill>
+                          <a:blip r:embed="rId24" cstate="print">
+                            <a:extLst>
+                              <a:ext uri="{28A0092B-C50C-407E-A947-70E740481C1C}">
+                                <a14:useLocalDpi xmlns:a14="http://schemas.microsoft.com/office/drawing/2010/main" val="0"/>
+                              </a:ext>
+                            </a:extLst>
+                          </a:blip>
+                          <a:stretch>
+                            <a:fillRect/>
+                          </a:stretch>
+                        </pic:blipFill>
+                        <pic:spPr>
+                          <a:xfrm>
+                            <a:off x="0" y="0"/>
+                            <a:ext cx="4522045" cy="7907015"/>
+                          </a:xfrm>
+                          <a:prstGeom prst="rect">
+                            <a:avLst/>
+                          </a:prstGeom>
+                        </pic:spPr>
+                      </pic:pic>
+                    </a:graphicData>
+                  </a:graphic>
+                </wp:inline>
+              </w:drawing>
+            </w:r>
+          </w:p>
+          <w:p>
+            <w:pPr>
+              <w:spacing w:before="60" w:after="60"/>
+              <w:rPr>
+                <w:rFonts w:cs="Arial"/>
+                <w:b/>
+                <w:color w:val="000000"/>
+                <w:szCs w:val="20"/>
+              </w:rPr>
+            </w:pPr>
+            <w:r>
+              <w:rPr>
+                <w:rFonts w:cs="Arial"/>
+                <w:b/>
+                <w:color w:val="000000"/>
+                <w:szCs w:val="20"/>
+              </w:rPr>
+              <w:lastRenderedPageBreak/>
+              <w:t>Contact Us Page:</w:t>
+            </w:r>
+          </w:p>
+          <w:p>
+            <w:pPr>
+              <w:spacing w:before="60" w:after="60"/>
+              <w:rPr>
+                <w:rFonts w:cs="Arial"/>
+                <w:b/>
+                <w:color w:val="000000"/>
+                <w:szCs w:val="20"/>
+              </w:rPr>
+            </w:pPr>
+            <w:r>
+              <w:rPr>
+                <w:rFonts w:cs="Arial"/>
+                <w:b/>
+                <w:noProof/>
+                <w:color w:val="000000"/>
+                <w:szCs w:val="20"/>
+              </w:rPr>
+              <w:drawing>
+                <wp:inline distT="0" distB="0" distL="0" distR="0" wp14:anchorId="5D5DA410" wp14:editId="18A59FEE">
+                  <wp:extent cx="4921885" cy="6432550"/>
+                  <wp:effectExtent l="0" t="0" r="0" b="6350"/>
+                  <wp:docPr id="11" name="Picture 11"/>
+                  <wp:cNvGraphicFramePr>
+                    <a:graphicFrameLocks xmlns:a="http://schemas.openxmlformats.org/drawingml/2006/main" noChangeAspect="1"/>
+                  </wp:cNvGraphicFramePr>
+                  <a:graphic xmlns:a="http://schemas.openxmlformats.org/drawingml/2006/main">
+                    <a:graphicData uri="http://schemas.openxmlformats.org/drawingml/2006/picture">
+                      <pic:pic xmlns:pic="http://schemas.openxmlformats.org/drawingml/2006/picture">
+                        <pic:nvPicPr>
+                          <pic:cNvPr id="11" name="WireFrameContactUs.png"/>
+                          <pic:cNvPicPr/>
+                        </pic:nvPicPr>
+                        <pic:blipFill>
+                          <a:blip r:embed="rId25" cstate="print">
+                            <a:extLst>
+                              <a:ext uri="{28A0092B-C50C-407E-A947-70E740481C1C}">
+                                <a14:useLocalDpi xmlns:a14="http://schemas.microsoft.com/office/drawing/2010/main" val="0"/>
+                              </a:ext>
+                            </a:extLst>
+                          </a:blip>
+                          <a:stretch>
+                            <a:fillRect/>
+                          </a:stretch>
+                        </pic:blipFill>
+                        <pic:spPr>
+                          <a:xfrm>
+                            <a:off x="0" y="0"/>
+                            <a:ext cx="4921885" cy="6432550"/>
+                          </a:xfrm>
+                          <a:prstGeom prst="rect">
+                            <a:avLst/>
+                          </a:prstGeom>
+                        </pic:spPr>
+                      </pic:pic>
+                    </a:graphicData>
+                  </a:graphic>
+                </wp:inline>
+              </w:drawing>
+            </w:r>
+          </w:p>
+          <w:p>
+            <w:pPr>
+              <w:spacing w:before="60" w:after="60"/>
+              <w:rPr>
+                <w:rFonts w:cs="Arial"/>
+                <w:b/>
+                <w:color w:val="000000"/>
+                <w:szCs w:val="20"/>
+              </w:rPr>
+            </w:pPr>
+            <w:r>
+              <w:rPr>
+                <w:rFonts w:cs="Arial"/>
+                <w:b/>
+                <w:color w:val="000000"/>
+                <w:szCs w:val="20"/>
+              </w:rPr>
+              <w:t xml:space="preserve">URL: </w:t>
+            </w:r>
+            <w:hyperlink r:id="rId26" w:history="1">
+              <w:r>
+                <w:rPr>
+                  <w:rStyle w:val="Hyperlink"/>
+                  <w:rFonts w:cs="Arial"/>
+                  <w:b/>
+                  <w:szCs w:val="20"/>
+                </w:rPr>
+                <w:t>https://www.figma.com/design/TqG4vt9RHHg5zwC6tXwraD/Assessment-2---Identify-and-Resolve-Client-ICT-Problems?m=auto&amp;t=LrhUNoEvIK8fCOzD-6</w:t>
+              </w:r>
+            </w:hyperlink>
+          </w:p>
+          <w:p>
+            <w:pPr>
+              <w:spacing w:before="60" w:after="60"/>
+              <w:rPr>
+                <w:rFonts w:cs="Arial"/>
+                <w:b/>
+                <w:color w:val="000000"/>
+                <w:szCs w:val="20"/>
+              </w:rPr>
+            </w:pPr>
+            <w:r>
+              <w:rPr>
+                <w:rFonts w:cs="Arial"/>
+                <w:b/>
+                <w:color w:val="000000"/>
+                <w:szCs w:val="20"/>
+              </w:rPr>
+              <w:lastRenderedPageBreak/>
+              <w:t>LOGO:</w:t>
+            </w:r>
+            <w:r>
+              <w:rPr>
+                <w:rFonts w:cs="Arial"/>
+                <w:b/>
+                <w:noProof/>
+                <w:color w:val="000000"/>
+                <w:szCs w:val="20"/>
+              </w:rPr>
+              <w:t xml:space="preserve"> </w:t>
+            </w:r>
+            <w:r>
+              <w:rPr>
+                <w:rFonts w:cs="Arial"/>
+                <w:b/>
+                <w:noProof/>
+                <w:color w:val="000000"/>
+                <w:szCs w:val="20"/>
+              </w:rPr>
+              <w:t>Please find the logo</w:t>
+            </w:r>
+            <w:r>
+              <w:rPr>
+                <w:rFonts w:cs="Arial"/>
+                <w:b/>
+                <w:noProof/>
+                <w:color w:val="000000"/>
+                <w:szCs w:val="20"/>
+              </w:rPr>
+              <w:t xml:space="preserve"> file</w:t>
+            </w:r>
+            <w:r>
+              <w:rPr>
+                <w:rFonts w:cs="Arial"/>
+                <w:b/>
+                <w:noProof/>
+                <w:color w:val="000000"/>
+                <w:szCs w:val="20"/>
+              </w:rPr>
+              <w:t xml:space="preserve"> attached.</w:t>
+            </w:r>
+            <w:r>
+              <w:rPr>
+                <w:rFonts w:cs="Arial"/>
+                <w:b/>
+                <w:noProof/>
+                <w:color w:val="000000"/>
+                <w:szCs w:val="20"/>
+              </w:rPr>
+              <w:drawing>
+                <wp:inline distT="0" distB="0" distL="0" distR="0" wp14:anchorId="7F3F3BE7" wp14:editId="37EA0780">
+                  <wp:extent cx="4921885" cy="2285365"/>
+                  <wp:effectExtent l="0" t="0" r="0" b="0"/>
+                  <wp:docPr id="7" name="Picture 7"/>
+                  <wp:cNvGraphicFramePr>
+                    <a:graphicFrameLocks xmlns:a="http://schemas.openxmlformats.org/drawingml/2006/main" noChangeAspect="1"/>
+                  </wp:cNvGraphicFramePr>
+                  <a:graphic xmlns:a="http://schemas.openxmlformats.org/drawingml/2006/main">
+                    <a:graphicData uri="http://schemas.openxmlformats.org/drawingml/2006/picture">
+                      <pic:pic xmlns:pic="http://schemas.openxmlformats.org/drawingml/2006/picture">
+                        <pic:nvPicPr>
+                          <pic:cNvPr id="7" name="Logo EVORide.png"/>
+                          <pic:cNvPicPr/>
+                        </pic:nvPicPr>
+                        <pic:blipFill>
+                          <a:blip r:embed="rId27">
+                            <a:extLst>
+                              <a:ext uri="{28A0092B-C50C-407E-A947-70E740481C1C}">
+                                <a14:useLocalDpi xmlns:a14="http://schemas.microsoft.com/office/drawing/2010/main" val="0"/>
+                              </a:ext>
+                            </a:extLst>
+                          </a:blip>
+                          <a:stretch>
+                            <a:fillRect/>
+                          </a:stretch>
+                        </pic:blipFill>
+                        <pic:spPr>
+                          <a:xfrm>
+                            <a:off x="0" y="0"/>
+                            <a:ext cx="4921885" cy="2285365"/>
+                          </a:xfrm>
+                          <a:prstGeom prst="rect">
+                            <a:avLst/>
+                          </a:prstGeom>
+                        </pic:spPr>
+                      </pic:pic>
+                    </a:graphicData>
+                  </a:graphic>
+                </wp:inline>
+              </w:drawing>
+            </w:r>
+          </w:p>
+          <w:p>
+            <w:pPr>
+              <w:spacing w:before="60" w:after="60"/>
+              <w:rPr>
+                <w:rFonts w:cs="Arial"/>
+                <w:b/>
+                <w:color w:val="000000"/>
+                <w:szCs w:val="20"/>
+              </w:rPr>
+            </w:pPr>
+            <w:r>
+              <w:rPr>
+                <w:rFonts w:cs="Arial"/>
+                <w:b/>
+                <w:color w:val="000000"/>
+                <w:szCs w:val="20"/>
+              </w:rPr>
+              <w:t>File created by Inkscape.</w:t>
+            </w:r>
           </w:p>
         </w:tc>
         <w:tc>
@@ -14340,6 +15134,7 @@
                 <w:color w:val="000000"/>
                 <w:szCs w:val="20"/>
               </w:rPr>
+              <w:lastRenderedPageBreak/>
               <w:t>Comment:</w:t>
             </w:r>
           </w:p>
@@ -14361,7 +15156,6 @@
         <w:tc>
           <w:tcPr>
             <w:tcW w:w="1418" w:type="dxa"/>
-            <w:gridSpan w:val="2"/>
             <w:vMerge w:val="restart"/>
             <w:tcBorders>
               <w:top w:val="single" w:sz="4" w:space="0" w:color="7F7F7F"/>
@@ -14387,6 +15181,7 @@
                 <w:color w:val="000000"/>
                 <w:szCs w:val="20"/>
               </w:rPr>
+              <w:lastRenderedPageBreak/>
               <w:t xml:space="preserve">Question </w:t>
             </w:r>
             <w:r>
@@ -14411,7 +15206,6 @@
         <w:tc>
           <w:tcPr>
             <w:tcW w:w="6549" w:type="dxa"/>
-            <w:gridSpan w:val="4"/>
             <w:vMerge w:val="restart"/>
             <w:tcBorders>
               <w:top w:val="single" w:sz="4" w:space="0" w:color="7F7F7F"/>
@@ -14530,7 +15324,6 @@
         <w:tc>
           <w:tcPr>
             <w:tcW w:w="1418" w:type="dxa"/>
-            <w:gridSpan w:val="2"/>
             <w:vMerge/>
             <w:shd w:val="clear" w:color="auto" w:fill="F2F2F2"/>
           </w:tcPr>
@@ -14550,7 +15343,6 @@
         <w:tc>
           <w:tcPr>
             <w:tcW w:w="6549" w:type="dxa"/>
-            <w:gridSpan w:val="4"/>
             <w:vMerge/>
             <w:shd w:val="clear" w:color="auto" w:fill="auto"/>
           </w:tcPr>
@@ -14640,18 +15432,12 @@
         <w:tc>
           <w:tcPr>
             <w:tcW w:w="7967" w:type="dxa"/>
-            <w:gridSpan w:val="6"/>
+            <w:gridSpan w:val="2"/>
             <w:shd w:val="clear" w:color="auto" w:fill="auto"/>
           </w:tcPr>
           <w:p>
             <w:pPr>
               <w:spacing w:before="60" w:after="60"/>
-              <w:rPr>
-                <w:rFonts w:cs="Arial"/>
-                <w:b/>
-                <w:color w:val="000000"/>
-                <w:szCs w:val="20"/>
-              </w:rPr>
             </w:pPr>
             <w:r>
               <w:rPr>
@@ -14662,12 +15448,599 @@
               </w:rPr>
               <w:t>Answer:</w:t>
             </w:r>
-          </w:p>
-          <w:p>
-            <w:pPr>
-              <w:tabs>
-                <w:tab w:val="center" w:pos="3883"/>
-              </w:tabs>
+            <w:r>
+              <w:t xml:space="preserve"> </w:t>
+            </w:r>
+          </w:p>
+          <w:p>
+            <w:pPr>
+              <w:pStyle w:val="ListParagraph"/>
+              <w:numPr>
+                <w:ilvl w:val="0"/>
+                <w:numId w:val="39"/>
+              </w:numPr>
+              <w:spacing w:before="60" w:after="60"/>
+              <w:rPr>
+                <w:rFonts w:cs="Arial"/>
+                <w:b/>
+                <w:color w:val="000000"/>
+                <w:szCs w:val="20"/>
+              </w:rPr>
+            </w:pPr>
+            <w:r>
+              <w:rPr>
+                <w:rFonts w:cs="Arial"/>
+                <w:color w:val="000000"/>
+                <w:szCs w:val="20"/>
+              </w:rPr>
+              <w:t>Understanding the Organizational Structure:</w:t>
+            </w:r>
+          </w:p>
+          <w:p>
+            <w:pPr>
+              <w:pStyle w:val="ListParagraph"/>
+              <w:numPr>
+                <w:ilvl w:val="1"/>
+                <w:numId w:val="39"/>
+              </w:numPr>
+              <w:spacing w:before="60" w:after="60"/>
+              <w:rPr>
+                <w:rFonts w:cs="Arial"/>
+                <w:color w:val="000000"/>
+                <w:szCs w:val="20"/>
+              </w:rPr>
+            </w:pPr>
+            <w:r>
+              <w:rPr>
+                <w:rFonts w:cs="Arial"/>
+                <w:color w:val="000000"/>
+                <w:szCs w:val="20"/>
+              </w:rPr>
+              <w:t xml:space="preserve">CEO, Directors: </w:t>
+            </w:r>
+            <w:r>
+              <w:rPr>
+                <w:rFonts w:cs="Arial"/>
+                <w:color w:val="000000"/>
+                <w:szCs w:val="20"/>
+              </w:rPr>
+              <w:t xml:space="preserve">They response </w:t>
+            </w:r>
+            <w:r>
+              <w:rPr>
+                <w:rFonts w:cs="Arial"/>
+                <w:color w:val="000000"/>
+                <w:szCs w:val="20"/>
+              </w:rPr>
+              <w:t>for setting project goals and</w:t>
+            </w:r>
+            <w:r>
+              <w:rPr>
+                <w:rFonts w:cs="Arial"/>
+                <w:color w:val="000000"/>
+                <w:szCs w:val="20"/>
+              </w:rPr>
+              <w:t xml:space="preserve"> making decisions for</w:t>
+            </w:r>
+            <w:r>
+              <w:rPr>
+                <w:rFonts w:cs="Arial"/>
+                <w:color w:val="000000"/>
+                <w:szCs w:val="20"/>
+              </w:rPr>
+              <w:t xml:space="preserve"> strateg</w:t>
+            </w:r>
+            <w:r>
+              <w:rPr>
+                <w:rFonts w:cs="Arial"/>
+                <w:color w:val="000000"/>
+                <w:szCs w:val="20"/>
+              </w:rPr>
+              <w:t>ies.</w:t>
+            </w:r>
+          </w:p>
+          <w:p>
+            <w:pPr>
+              <w:pStyle w:val="ListParagraph"/>
+              <w:numPr>
+                <w:ilvl w:val="1"/>
+                <w:numId w:val="39"/>
+              </w:numPr>
+              <w:spacing w:before="60" w:after="60"/>
+              <w:rPr>
+                <w:rFonts w:cs="Arial"/>
+                <w:color w:val="000000"/>
+                <w:szCs w:val="20"/>
+              </w:rPr>
+            </w:pPr>
+            <w:r>
+              <w:rPr>
+                <w:rFonts w:cs="Arial"/>
+                <w:color w:val="000000"/>
+                <w:szCs w:val="20"/>
+              </w:rPr>
+              <w:t xml:space="preserve">Project Managers: </w:t>
+            </w:r>
+            <w:r>
+              <w:rPr>
+                <w:rFonts w:cs="Arial"/>
+                <w:color w:val="000000"/>
+                <w:szCs w:val="20"/>
+              </w:rPr>
+              <w:t>They track and manage</w:t>
+            </w:r>
+            <w:r>
+              <w:rPr>
+                <w:rFonts w:cs="Arial"/>
+                <w:color w:val="000000"/>
+                <w:szCs w:val="20"/>
+              </w:rPr>
+              <w:t xml:space="preserve"> project timelines, resources, and task.</w:t>
+            </w:r>
+          </w:p>
+          <w:p>
+            <w:pPr>
+              <w:pStyle w:val="ListParagraph"/>
+              <w:numPr>
+                <w:ilvl w:val="1"/>
+                <w:numId w:val="39"/>
+              </w:numPr>
+              <w:spacing w:before="60" w:after="60"/>
+              <w:rPr>
+                <w:rFonts w:cs="Arial"/>
+                <w:color w:val="000000"/>
+                <w:szCs w:val="20"/>
+              </w:rPr>
+            </w:pPr>
+            <w:r>
+              <w:rPr>
+                <w:rFonts w:cs="Arial"/>
+                <w:color w:val="000000"/>
+                <w:szCs w:val="20"/>
+              </w:rPr>
+              <w:t>Design Team:</w:t>
+            </w:r>
+            <w:r>
+              <w:rPr>
+                <w:rFonts w:cs="Arial"/>
+                <w:color w:val="000000"/>
+                <w:szCs w:val="20"/>
+              </w:rPr>
+              <w:t xml:space="preserve"> They response</w:t>
+            </w:r>
+            <w:r>
+              <w:rPr>
+                <w:rFonts w:cs="Arial"/>
+                <w:color w:val="000000"/>
+                <w:szCs w:val="20"/>
+              </w:rPr>
+              <w:t xml:space="preserve"> for updating and improving website designs.</w:t>
+            </w:r>
+          </w:p>
+          <w:p>
+            <w:pPr>
+              <w:pStyle w:val="ListParagraph"/>
+              <w:numPr>
+                <w:ilvl w:val="1"/>
+                <w:numId w:val="39"/>
+              </w:numPr>
+              <w:spacing w:before="60" w:after="60"/>
+              <w:rPr>
+                <w:rFonts w:cs="Arial"/>
+                <w:color w:val="000000"/>
+                <w:szCs w:val="20"/>
+              </w:rPr>
+            </w:pPr>
+            <w:r>
+              <w:rPr>
+                <w:rFonts w:cs="Arial"/>
+                <w:color w:val="000000"/>
+                <w:szCs w:val="20"/>
+              </w:rPr>
+              <w:t>Development Team: Focuses on coding, technical aspects, and implementation.</w:t>
+            </w:r>
+          </w:p>
+          <w:p>
+            <w:pPr>
+              <w:pStyle w:val="ListParagraph"/>
+              <w:numPr>
+                <w:ilvl w:val="0"/>
+                <w:numId w:val="39"/>
+              </w:numPr>
+              <w:spacing w:before="60" w:after="60"/>
+              <w:rPr>
+                <w:rFonts w:cs="Arial"/>
+                <w:color w:val="000000"/>
+                <w:szCs w:val="20"/>
+              </w:rPr>
+            </w:pPr>
+            <w:r>
+              <w:rPr>
+                <w:rFonts w:cs="Arial"/>
+                <w:color w:val="000000"/>
+                <w:szCs w:val="20"/>
+              </w:rPr>
+              <w:t>Assign Responsibilities:</w:t>
+            </w:r>
+          </w:p>
+          <w:p>
+            <w:pPr>
+              <w:pStyle w:val="ListParagraph"/>
+              <w:numPr>
+                <w:ilvl w:val="1"/>
+                <w:numId w:val="39"/>
+              </w:numPr>
+              <w:spacing w:before="60" w:after="60"/>
+              <w:rPr>
+                <w:rFonts w:cs="Arial"/>
+                <w:color w:val="000000"/>
+                <w:szCs w:val="20"/>
+              </w:rPr>
+            </w:pPr>
+            <w:r>
+              <w:rPr>
+                <w:rFonts w:cs="Arial"/>
+                <w:color w:val="000000"/>
+                <w:szCs w:val="20"/>
+              </w:rPr>
+              <w:t xml:space="preserve">CEO or </w:t>
+            </w:r>
+            <w:r>
+              <w:rPr>
+                <w:rFonts w:cs="Arial"/>
+                <w:color w:val="000000"/>
+                <w:szCs w:val="20"/>
+              </w:rPr>
+              <w:t>Directors</w:t>
+            </w:r>
+            <w:r>
+              <w:rPr>
+                <w:rFonts w:cs="Arial"/>
+                <w:color w:val="000000"/>
+                <w:szCs w:val="20"/>
+              </w:rPr>
+              <w:t xml:space="preserve"> </w:t>
+            </w:r>
+            <w:r>
+              <w:rPr>
+                <w:rFonts w:cs="Arial"/>
+                <w:color w:val="000000"/>
+                <w:szCs w:val="20"/>
+              </w:rPr>
+              <w:t xml:space="preserve">makes decisions about the </w:t>
+            </w:r>
+            <w:r>
+              <w:t>s</w:t>
+            </w:r>
+            <w:r>
+              <w:t>cale of the project</w:t>
+            </w:r>
+            <w:r>
+              <w:t xml:space="preserve">s </w:t>
+            </w:r>
+            <w:r>
+              <w:rPr>
+                <w:rFonts w:cs="Arial"/>
+                <w:color w:val="000000"/>
+                <w:szCs w:val="20"/>
+              </w:rPr>
+              <w:t>and budget.</w:t>
+            </w:r>
+          </w:p>
+          <w:p>
+            <w:pPr>
+              <w:pStyle w:val="ListParagraph"/>
+              <w:numPr>
+                <w:ilvl w:val="1"/>
+                <w:numId w:val="39"/>
+              </w:numPr>
+              <w:spacing w:before="60" w:after="60"/>
+              <w:rPr>
+                <w:rFonts w:cs="Arial"/>
+                <w:color w:val="000000"/>
+                <w:szCs w:val="20"/>
+              </w:rPr>
+            </w:pPr>
+            <w:r>
+              <w:rPr>
+                <w:rFonts w:cs="Arial"/>
+                <w:color w:val="000000"/>
+                <w:szCs w:val="20"/>
+              </w:rPr>
+              <w:t>Project Managers handle task distribution, monitor progress, and resolve issues.</w:t>
+            </w:r>
+          </w:p>
+          <w:p>
+            <w:pPr>
+              <w:pStyle w:val="ListParagraph"/>
+              <w:numPr>
+                <w:ilvl w:val="1"/>
+                <w:numId w:val="39"/>
+              </w:numPr>
+              <w:spacing w:before="60" w:after="60"/>
+              <w:rPr>
+                <w:rFonts w:cs="Arial"/>
+                <w:color w:val="000000"/>
+                <w:szCs w:val="20"/>
+              </w:rPr>
+            </w:pPr>
+            <w:r>
+              <w:rPr>
+                <w:rFonts w:cs="Arial"/>
+                <w:color w:val="000000"/>
+                <w:szCs w:val="20"/>
+              </w:rPr>
+              <w:t>Design Team works on updating the visuals and layouts based on project requirements.</w:t>
+            </w:r>
+          </w:p>
+          <w:p>
+            <w:pPr>
+              <w:pStyle w:val="ListParagraph"/>
+              <w:numPr>
+                <w:ilvl w:val="1"/>
+                <w:numId w:val="39"/>
+              </w:numPr>
+              <w:spacing w:before="60" w:after="60"/>
+              <w:rPr>
+                <w:rFonts w:cs="Arial"/>
+                <w:color w:val="000000"/>
+                <w:szCs w:val="20"/>
+              </w:rPr>
+            </w:pPr>
+            <w:r>
+              <w:rPr>
+                <w:rFonts w:cs="Arial"/>
+                <w:color w:val="000000"/>
+                <w:szCs w:val="20"/>
+              </w:rPr>
+              <w:t>Development Team ensures the technical implementation aligns with the designs.</w:t>
+            </w:r>
+          </w:p>
+          <w:p>
+            <w:pPr>
+              <w:pStyle w:val="ListParagraph"/>
+              <w:numPr>
+                <w:ilvl w:val="0"/>
+                <w:numId w:val="39"/>
+              </w:numPr>
+              <w:spacing w:before="60" w:after="60"/>
+              <w:rPr>
+                <w:rFonts w:cs="Arial"/>
+                <w:color w:val="000000"/>
+                <w:szCs w:val="20"/>
+              </w:rPr>
+            </w:pPr>
+            <w:r>
+              <w:rPr>
+                <w:rFonts w:cs="Arial"/>
+                <w:color w:val="000000"/>
+                <w:szCs w:val="20"/>
+              </w:rPr>
+              <w:t>Communication:</w:t>
+            </w:r>
+          </w:p>
+          <w:p>
+            <w:pPr>
+              <w:pStyle w:val="ListParagraph"/>
+              <w:numPr>
+                <w:ilvl w:val="1"/>
+                <w:numId w:val="39"/>
+              </w:numPr>
+              <w:spacing w:before="60" w:after="60"/>
+              <w:rPr>
+                <w:rFonts w:cs="Arial"/>
+                <w:color w:val="000000"/>
+                <w:szCs w:val="20"/>
+              </w:rPr>
+            </w:pPr>
+            <w:r>
+              <w:rPr>
+                <w:rFonts w:cs="Arial"/>
+                <w:color w:val="000000"/>
+                <w:szCs w:val="20"/>
+              </w:rPr>
+              <w:t>Regular meetings between Project Managers and Design/Development teams ensure smooth coordination.</w:t>
+            </w:r>
+          </w:p>
+          <w:p>
+            <w:pPr>
+              <w:pStyle w:val="ListParagraph"/>
+              <w:numPr>
+                <w:ilvl w:val="1"/>
+                <w:numId w:val="39"/>
+              </w:numPr>
+              <w:spacing w:before="60" w:after="60"/>
+              <w:rPr>
+                <w:rFonts w:cs="Arial"/>
+                <w:color w:val="000000"/>
+                <w:szCs w:val="20"/>
+              </w:rPr>
+            </w:pPr>
+            <w:r>
+              <w:rPr>
+                <w:rFonts w:cs="Arial"/>
+                <w:color w:val="000000"/>
+                <w:szCs w:val="20"/>
+              </w:rPr>
+              <w:t>Feedback loops between the teams help in refining the designs and addressing any technical concerns.</w:t>
+            </w:r>
+          </w:p>
+          <w:p>
+            <w:pPr>
+              <w:pStyle w:val="ListParagraph"/>
+              <w:numPr>
+                <w:ilvl w:val="0"/>
+                <w:numId w:val="39"/>
+              </w:numPr>
+              <w:spacing w:before="60" w:after="60"/>
+              <w:rPr>
+                <w:rFonts w:cs="Arial"/>
+                <w:color w:val="000000"/>
+                <w:szCs w:val="20"/>
+              </w:rPr>
+            </w:pPr>
+            <w:r>
+              <w:rPr>
+                <w:rFonts w:cs="Arial"/>
+                <w:color w:val="000000"/>
+                <w:szCs w:val="20"/>
+              </w:rPr>
+              <w:t>Decision-Making &amp; Prioritization:</w:t>
+            </w:r>
+          </w:p>
+          <w:p>
+            <w:pPr>
+              <w:pStyle w:val="ListParagraph"/>
+              <w:numPr>
+                <w:ilvl w:val="1"/>
+                <w:numId w:val="39"/>
+              </w:numPr>
+              <w:spacing w:before="60" w:after="60"/>
+              <w:rPr>
+                <w:rFonts w:cs="Arial"/>
+                <w:color w:val="000000"/>
+                <w:szCs w:val="20"/>
+              </w:rPr>
+            </w:pPr>
+            <w:r>
+              <w:rPr>
+                <w:rFonts w:cs="Arial"/>
+                <w:color w:val="000000"/>
+                <w:szCs w:val="20"/>
+              </w:rPr>
+              <w:t xml:space="preserve">Strategic decisions come from </w:t>
+            </w:r>
+            <w:r>
+              <w:rPr>
+                <w:rFonts w:cs="Arial"/>
+                <w:color w:val="000000"/>
+                <w:szCs w:val="20"/>
+              </w:rPr>
+              <w:t>CEO or Directors</w:t>
+            </w:r>
+            <w:r>
+              <w:rPr>
+                <w:rFonts w:cs="Arial"/>
+                <w:color w:val="000000"/>
+                <w:szCs w:val="20"/>
+              </w:rPr>
+              <w:t>.</w:t>
+            </w:r>
+          </w:p>
+          <w:p>
+            <w:pPr>
+              <w:pStyle w:val="ListParagraph"/>
+              <w:numPr>
+                <w:ilvl w:val="1"/>
+                <w:numId w:val="39"/>
+              </w:numPr>
+              <w:spacing w:before="60" w:after="60"/>
+              <w:rPr>
+                <w:rFonts w:cs="Arial"/>
+                <w:color w:val="000000"/>
+                <w:szCs w:val="20"/>
+              </w:rPr>
+            </w:pPr>
+            <w:r>
+              <w:rPr>
+                <w:rFonts w:cs="Arial"/>
+                <w:color w:val="000000"/>
+                <w:szCs w:val="20"/>
+              </w:rPr>
+              <w:t>D</w:t>
+            </w:r>
+            <w:r>
+              <w:rPr>
+                <w:rFonts w:cs="Arial"/>
+                <w:color w:val="000000"/>
+                <w:szCs w:val="20"/>
+              </w:rPr>
+              <w:t xml:space="preserve">ecisions about </w:t>
+            </w:r>
+            <w:r>
+              <w:rPr>
+                <w:rFonts w:cs="Arial"/>
+                <w:color w:val="000000"/>
+                <w:szCs w:val="20"/>
+              </w:rPr>
+              <w:t>perform</w:t>
+            </w:r>
+            <w:r>
+              <w:rPr>
+                <w:rFonts w:cs="Arial"/>
+                <w:color w:val="000000"/>
+                <w:szCs w:val="20"/>
+              </w:rPr>
+              <w:t xml:space="preserve"> and deadlines are handled by Project Managers.</w:t>
+            </w:r>
+          </w:p>
+          <w:p>
+            <w:pPr>
+              <w:pStyle w:val="ListParagraph"/>
+              <w:numPr>
+                <w:ilvl w:val="1"/>
+                <w:numId w:val="39"/>
+              </w:numPr>
+              <w:spacing w:before="60" w:after="60"/>
+              <w:rPr>
+                <w:rFonts w:cs="Arial"/>
+                <w:color w:val="000000"/>
+                <w:szCs w:val="20"/>
+              </w:rPr>
+            </w:pPr>
+            <w:r>
+              <w:rPr>
+                <w:rFonts w:cs="Arial"/>
+                <w:color w:val="000000"/>
+                <w:szCs w:val="20"/>
+              </w:rPr>
+              <w:t>Work is prioriti</w:t>
+            </w:r>
+            <w:r>
+              <w:rPr>
+                <w:rFonts w:cs="Arial"/>
+                <w:color w:val="000000"/>
+                <w:szCs w:val="20"/>
+              </w:rPr>
+              <w:t>s</w:t>
+            </w:r>
+            <w:r>
+              <w:rPr>
+                <w:rFonts w:cs="Arial"/>
+                <w:color w:val="000000"/>
+                <w:szCs w:val="20"/>
+              </w:rPr>
+              <w:t>ed based on project goals, with design improvements</w:t>
+            </w:r>
+            <w:r>
+              <w:rPr>
+                <w:rFonts w:cs="Arial"/>
+                <w:color w:val="000000"/>
+                <w:szCs w:val="20"/>
+              </w:rPr>
+              <w:t>.</w:t>
+            </w:r>
+          </w:p>
+          <w:p>
+            <w:pPr>
+              <w:spacing w:before="60" w:after="60"/>
+              <w:rPr>
+                <w:rFonts w:cs="Arial"/>
+                <w:color w:val="000000"/>
+                <w:szCs w:val="20"/>
+              </w:rPr>
+            </w:pPr>
+            <w:r>
+              <w:rPr>
+                <w:rFonts w:cs="Arial"/>
+                <w:color w:val="000000"/>
+                <w:szCs w:val="20"/>
+              </w:rPr>
+              <w:br/>
+            </w:r>
+          </w:p>
+          <w:p>
+            <w:pPr>
               <w:spacing w:before="60" w:after="60"/>
               <w:rPr>
                 <w:rFonts w:cs="Arial"/>
@@ -14719,7 +16092,6 @@
         <w:tc>
           <w:tcPr>
             <w:tcW w:w="1418" w:type="dxa"/>
-            <w:gridSpan w:val="2"/>
             <w:vMerge w:val="restart"/>
             <w:tcBorders>
               <w:top w:val="single" w:sz="4" w:space="0" w:color="7F7F7F"/>
@@ -14770,7 +16142,6 @@
         <w:tc>
           <w:tcPr>
             <w:tcW w:w="6549" w:type="dxa"/>
-            <w:gridSpan w:val="4"/>
             <w:vMerge w:val="restart"/>
             <w:tcBorders>
               <w:top w:val="single" w:sz="4" w:space="0" w:color="7F7F7F"/>
@@ -14871,7 +16242,6 @@
         <w:tc>
           <w:tcPr>
             <w:tcW w:w="1418" w:type="dxa"/>
-            <w:gridSpan w:val="2"/>
             <w:vMerge/>
             <w:shd w:val="clear" w:color="auto" w:fill="F2F2F2"/>
           </w:tcPr>
@@ -14891,7 +16261,6 @@
         <w:tc>
           <w:tcPr>
             <w:tcW w:w="6549" w:type="dxa"/>
-            <w:gridSpan w:val="4"/>
             <w:vMerge/>
             <w:shd w:val="clear" w:color="auto" w:fill="auto"/>
           </w:tcPr>
@@ -14981,18 +16350,12 @@
         <w:tc>
           <w:tcPr>
             <w:tcW w:w="7967" w:type="dxa"/>
-            <w:gridSpan w:val="6"/>
+            <w:gridSpan w:val="2"/>
             <w:shd w:val="clear" w:color="auto" w:fill="auto"/>
           </w:tcPr>
           <w:p>
             <w:pPr>
               <w:spacing w:before="60" w:after="60"/>
-              <w:rPr>
-                <w:rFonts w:cs="Arial"/>
-                <w:b/>
-                <w:color w:val="000000"/>
-                <w:szCs w:val="20"/>
-              </w:rPr>
             </w:pPr>
             <w:r>
               <w:rPr>
@@ -15003,19 +16366,93 @@
               </w:rPr>
               <w:t>Answer:</w:t>
             </w:r>
-          </w:p>
-          <w:p>
-            <w:pPr>
-              <w:tabs>
-                <w:tab w:val="center" w:pos="3883"/>
-              </w:tabs>
+            <w:r>
+              <w:t xml:space="preserve"> </w:t>
+            </w:r>
+          </w:p>
+          <w:p>
+            <w:pPr>
               <w:spacing w:before="60" w:after="60"/>
-              <w:rPr>
-                <w:rFonts w:cs="Arial"/>
-                <w:color w:val="000000"/>
-                <w:szCs w:val="20"/>
-              </w:rPr>
-            </w:pPr>
+            </w:pPr>
+            <w:r>
+              <w:t xml:space="preserve">This decision-making process works well for </w:t>
+            </w:r>
+            <w:proofErr w:type="spellStart"/>
+            <w:r>
+              <w:t>Motionweb</w:t>
+            </w:r>
+            <w:proofErr w:type="spellEnd"/>
+            <w:r>
+              <w:t xml:space="preserve"> Studios</w:t>
+            </w:r>
+            <w:r>
+              <w:t xml:space="preserve"> because:</w:t>
+            </w:r>
+          </w:p>
+          <w:p>
+            <w:pPr>
+              <w:pStyle w:val="ListParagraph"/>
+              <w:numPr>
+                <w:ilvl w:val="0"/>
+                <w:numId w:val="40"/>
+              </w:numPr>
+              <w:spacing w:before="60" w:after="60"/>
+            </w:pPr>
+            <w:r>
+              <w:t>It defines clear roles and responsibilities.</w:t>
+            </w:r>
+          </w:p>
+          <w:p>
+            <w:pPr>
+              <w:pStyle w:val="ListParagraph"/>
+              <w:numPr>
+                <w:ilvl w:val="0"/>
+                <w:numId w:val="40"/>
+              </w:numPr>
+              <w:spacing w:before="60" w:after="60"/>
+            </w:pPr>
+            <w:r>
+              <w:t xml:space="preserve">It allows efficient task </w:t>
+            </w:r>
+            <w:r>
+              <w:t>assignments</w:t>
+            </w:r>
+            <w:r>
+              <w:t>.</w:t>
+            </w:r>
+          </w:p>
+          <w:p>
+            <w:pPr>
+              <w:pStyle w:val="ListParagraph"/>
+              <w:numPr>
+                <w:ilvl w:val="0"/>
+                <w:numId w:val="40"/>
+              </w:numPr>
+              <w:spacing w:before="60" w:after="60"/>
+            </w:pPr>
+            <w:r>
+              <w:t xml:space="preserve">Regular communication helps keep teams on track. </w:t>
+            </w:r>
+          </w:p>
+          <w:p>
+            <w:pPr>
+              <w:pStyle w:val="ListParagraph"/>
+              <w:numPr>
+                <w:ilvl w:val="0"/>
+                <w:numId w:val="40"/>
+              </w:numPr>
+              <w:spacing w:before="60" w:after="60"/>
+              <w:rPr>
+                <w:rFonts w:cs="Arial"/>
+                <w:color w:val="000000"/>
+                <w:szCs w:val="20"/>
+              </w:rPr>
+            </w:pPr>
+            <w:r>
+              <w:t>Prioritizing tasks based on project objectives ensures the project stays focused and meets deadlines.</w:t>
+            </w:r>
+            <w:bookmarkStart w:id="0" w:name="_GoBack"/>
+            <w:bookmarkEnd w:id="0"/>
           </w:p>
         </w:tc>
         <w:tc>
@@ -15060,7 +16497,6 @@
         <w:tc>
           <w:tcPr>
             <w:tcW w:w="1418" w:type="dxa"/>
-            <w:gridSpan w:val="2"/>
             <w:tcBorders>
               <w:top w:val="single" w:sz="4" w:space="0" w:color="7F7F7F"/>
               <w:bottom w:val="single" w:sz="4" w:space="0" w:color="7F7F7F"/>
@@ -15104,7 +16540,7 @@
         <w:tc>
           <w:tcPr>
             <w:tcW w:w="9214" w:type="dxa"/>
-            <w:gridSpan w:val="6"/>
+            <w:gridSpan w:val="3"/>
             <w:tcBorders>
               <w:top w:val="single" w:sz="4" w:space="0" w:color="7F7F7F"/>
               <w:bottom w:val="single" w:sz="4" w:space="0" w:color="7F7F7F"/>
@@ -15172,7 +16608,7 @@
         <w:tc>
           <w:tcPr>
             <w:tcW w:w="10632" w:type="dxa"/>
-            <w:gridSpan w:val="8"/>
+            <w:gridSpan w:val="4"/>
             <w:tcBorders>
               <w:top w:val="single" w:sz="4" w:space="0" w:color="7F7F7F"/>
               <w:bottom w:val="single" w:sz="4" w:space="0" w:color="7F7F7F"/>
@@ -16732,7 +18168,14 @@
               <w:rPr>
                 <w:rFonts w:cs="Arial"/>
               </w:rPr>
-              <w:t>The learner has provided the resolution advice and support to the client’s design issues</w:t>
+              <w:t xml:space="preserve">The learner has provided the resolution advice and </w:t>
+            </w:r>
+            <w:r>
+              <w:rPr>
+                <w:rFonts w:cs="Arial"/>
+              </w:rPr>
+              <w:lastRenderedPageBreak/>
+              <w:t>support to the client’s design issues</w:t>
             </w:r>
             <w:r>
               <w:rPr>
@@ -17121,7 +18564,6 @@
                 <w:color w:val="000000"/>
                 <w:szCs w:val="20"/>
               </w:rPr>
-              <w:lastRenderedPageBreak/>
               <w:t xml:space="preserve">Part </w:t>
             </w:r>
             <w:r>
@@ -18573,6 +20015,7 @@
               <w:outlineLvl w:val="3"/>
             </w:pPr>
             <w:r>
+              <w:lastRenderedPageBreak/>
               <w:t>In this assessment task you will be performing the following activities:</w:t>
             </w:r>
           </w:p>
@@ -19435,7 +20878,6 @@
               <w:rPr>
                 <w:rFonts w:cs="Arial"/>
               </w:rPr>
-              <w:lastRenderedPageBreak/>
               <w:t>The learner has forwarded client feedback to required personnel for sign-off and record in problems database</w:t>
             </w:r>
           </w:p>
@@ -21288,6 +22730,7 @@
                 <w:color w:val="000000"/>
                 <w:szCs w:val="20"/>
               </w:rPr>
+              <w:lastRenderedPageBreak/>
               <w:t>Answer:</w:t>
             </w:r>
           </w:p>
@@ -23145,6 +24588,7 @@
               <w:rPr>
                 <w:rStyle w:val="Strong"/>
               </w:rPr>
+              <w:lastRenderedPageBreak/>
               <w:t>Assessor feedback (as appropriate)</w:t>
             </w:r>
             <w:r>
@@ -23369,7 +24813,6 @@
               <w:rPr>
                 <w:rStyle w:val="Strong"/>
               </w:rPr>
-              <w:lastRenderedPageBreak/>
               <w:t>Assessor name:</w:t>
             </w:r>
             <w:r>
@@ -23453,7 +24896,7 @@
     </w:tbl>
     <w:p/>
     <w:sectPr>
-      <w:headerReference w:type="default" r:id="rId17"/>
+      <w:headerReference w:type="default" r:id="rId28"/>
       <w:pgSz w:w="11906" w:h="16838" w:code="9"/>
       <w:pgMar w:top="567" w:right="709" w:bottom="851" w:left="709" w:header="567" w:footer="510" w:gutter="0"/>
       <w:cols w:space="708"/>
@@ -24724,6 +26167,119 @@
     </w:lvl>
   </w:abstractNum>
   <w:abstractNum w:abstractNumId="6" w15:restartNumberingAfterBreak="0">
+    <w:nsid w:val="18C459FF"/>
+    <w:multiLevelType w:val="hybridMultilevel"/>
+    <w:tmpl w:val="B492E5C6"/>
+    <w:lvl w:ilvl="0" w:tplc="0C090001">
+      <w:start w:val="1"/>
+      <w:numFmt w:val="bullet"/>
+      <w:lvlText w:val=""/>
+      <w:lvlJc w:val="left"/>
+      <w:pPr>
+        <w:ind w:left="720" w:hanging="360"/>
+      </w:pPr>
+      <w:rPr>
+        <w:rFonts w:ascii="Symbol" w:hAnsi="Symbol" w:hint="default"/>
+      </w:rPr>
+    </w:lvl>
+    <w:lvl w:ilvl="1" w:tplc="0C090003" w:tentative="1">
+      <w:start w:val="1"/>
+      <w:numFmt w:val="bullet"/>
+      <w:lvlText w:val="o"/>
+      <w:lvlJc w:val="left"/>
+      <w:pPr>
+        <w:ind w:left="1440" w:hanging="360"/>
+      </w:pPr>
+      <w:rPr>
+        <w:rFonts w:ascii="Courier New" w:hAnsi="Courier New" w:cs="Courier New" w:hint="default"/>
+      </w:rPr>
+    </w:lvl>
+    <w:lvl w:ilvl="2" w:tplc="0C090005" w:tentative="1">
+      <w:start w:val="1"/>
+      <w:numFmt w:val="bullet"/>
+      <w:lvlText w:val=""/>
+      <w:lvlJc w:val="left"/>
+      <w:pPr>
+        <w:ind w:left="2160" w:hanging="360"/>
+      </w:pPr>
+      <w:rPr>
+        <w:rFonts w:ascii="Wingdings" w:hAnsi="Wingdings" w:hint="default"/>
+      </w:rPr>
+    </w:lvl>
+    <w:lvl w:ilvl="3" w:tplc="0C090001" w:tentative="1">
+      <w:start w:val="1"/>
+      <w:numFmt w:val="bullet"/>
+      <w:lvlText w:val=""/>
+      <w:lvlJc w:val="left"/>
+      <w:pPr>
+        <w:ind w:left="2880" w:hanging="360"/>
+      </w:pPr>
+      <w:rPr>
+        <w:rFonts w:ascii="Symbol" w:hAnsi="Symbol" w:hint="default"/>
+      </w:rPr>
+    </w:lvl>
+    <w:lvl w:ilvl="4" w:tplc="0C090003" w:tentative="1">
+      <w:start w:val="1"/>
+      <w:numFmt w:val="bullet"/>
+      <w:lvlText w:val="o"/>
+      <w:lvlJc w:val="left"/>
+      <w:pPr>
+        <w:ind w:left="3600" w:hanging="360"/>
+      </w:pPr>
+      <w:rPr>
+        <w:rFonts w:ascii="Courier New" w:hAnsi="Courier New" w:cs="Courier New" w:hint="default"/>
+      </w:rPr>
+    </w:lvl>
+    <w:lvl w:ilvl="5" w:tplc="0C090005" w:tentative="1">
+      <w:start w:val="1"/>
+      <w:numFmt w:val="bullet"/>
+      <w:lvlText w:val=""/>
+      <w:lvlJc w:val="left"/>
+      <w:pPr>
+        <w:ind w:left="4320" w:hanging="360"/>
+      </w:pPr>
+      <w:rPr>
+        <w:rFonts w:ascii="Wingdings" w:hAnsi="Wingdings" w:hint="default"/>
+      </w:rPr>
+    </w:lvl>
+    <w:lvl w:ilvl="6" w:tplc="0C090001" w:tentative="1">
+      <w:start w:val="1"/>
+      <w:numFmt w:val="bullet"/>
+      <w:lvlText w:val=""/>
+      <w:lvlJc w:val="left"/>
+      <w:pPr>
+        <w:ind w:left="5040" w:hanging="360"/>
+      </w:pPr>
+      <w:rPr>
+        <w:rFonts w:ascii="Symbol" w:hAnsi="Symbol" w:hint="default"/>
+      </w:rPr>
+    </w:lvl>
+    <w:lvl w:ilvl="7" w:tplc="0C090003" w:tentative="1">
+      <w:start w:val="1"/>
+      <w:numFmt w:val="bullet"/>
+      <w:lvlText w:val="o"/>
+      <w:lvlJc w:val="left"/>
+      <w:pPr>
+        <w:ind w:left="5760" w:hanging="360"/>
+      </w:pPr>
+      <w:rPr>
+        <w:rFonts w:ascii="Courier New" w:hAnsi="Courier New" w:cs="Courier New" w:hint="default"/>
+      </w:rPr>
+    </w:lvl>
+    <w:lvl w:ilvl="8" w:tplc="0C090005" w:tentative="1">
+      <w:start w:val="1"/>
+      <w:numFmt w:val="bullet"/>
+      <w:lvlText w:val=""/>
+      <w:lvlJc w:val="left"/>
+      <w:pPr>
+        <w:ind w:left="6480" w:hanging="360"/>
+      </w:pPr>
+      <w:rPr>
+        <w:rFonts w:ascii="Wingdings" w:hAnsi="Wingdings" w:hint="default"/>
+      </w:rPr>
+    </w:lvl>
+  </w:abstractNum>
+  <w:abstractNum w:abstractNumId="7" w15:restartNumberingAfterBreak="0">
     <w:nsid w:val="1DA73977"/>
     <w:multiLevelType w:val="hybridMultilevel"/>
     <w:tmpl w:val="AE28D35A"/>
@@ -24836,7 +26392,93 @@
       </w:rPr>
     </w:lvl>
   </w:abstractNum>
-  <w:abstractNum w:abstractNumId="7" w15:restartNumberingAfterBreak="0">
+  <w:abstractNum w:abstractNumId="8" w15:restartNumberingAfterBreak="0">
+    <w:nsid w:val="1EDC1E9F"/>
+    <w:multiLevelType w:val="hybridMultilevel"/>
+    <w:tmpl w:val="FDA2FBF0"/>
+    <w:lvl w:ilvl="0" w:tplc="0C09000F">
+      <w:start w:val="1"/>
+      <w:numFmt w:val="decimal"/>
+      <w:lvlText w:val="%1."/>
+      <w:lvlJc w:val="left"/>
+      <w:pPr>
+        <w:ind w:left="720" w:hanging="360"/>
+      </w:pPr>
+    </w:lvl>
+    <w:lvl w:ilvl="1" w:tplc="0C090019" w:tentative="1">
+      <w:start w:val="1"/>
+      <w:numFmt w:val="lowerLetter"/>
+      <w:lvlText w:val="%2."/>
+      <w:lvlJc w:val="left"/>
+      <w:pPr>
+        <w:ind w:left="1440" w:hanging="360"/>
+      </w:pPr>
+    </w:lvl>
+    <w:lvl w:ilvl="2" w:tplc="0C09001B" w:tentative="1">
+      <w:start w:val="1"/>
+      <w:numFmt w:val="lowerRoman"/>
+      <w:lvlText w:val="%3."/>
+      <w:lvlJc w:val="right"/>
+      <w:pPr>
+        <w:ind w:left="2160" w:hanging="180"/>
+      </w:pPr>
+    </w:lvl>
+    <w:lvl w:ilvl="3" w:tplc="0C09000F" w:tentative="1">
+      <w:start w:val="1"/>
+      <w:numFmt w:val="decimal"/>
+      <w:lvlText w:val="%4."/>
+      <w:lvlJc w:val="left"/>
+      <w:pPr>
+        <w:ind w:left="2880" w:hanging="360"/>
+      </w:pPr>
+    </w:lvl>
+    <w:lvl w:ilvl="4" w:tplc="0C090019" w:tentative="1">
+      <w:start w:val="1"/>
+      <w:numFmt w:val="lowerLetter"/>
+      <w:lvlText w:val="%5."/>
+      <w:lvlJc w:val="left"/>
+      <w:pPr>
+        <w:ind w:left="3600" w:hanging="360"/>
+      </w:pPr>
+    </w:lvl>
+    <w:lvl w:ilvl="5" w:tplc="0C09001B" w:tentative="1">
+      <w:start w:val="1"/>
+      <w:numFmt w:val="lowerRoman"/>
+      <w:lvlText w:val="%6."/>
+      <w:lvlJc w:val="right"/>
+      <w:pPr>
+        <w:ind w:left="4320" w:hanging="180"/>
+      </w:pPr>
+    </w:lvl>
+    <w:lvl w:ilvl="6" w:tplc="0C09000F" w:tentative="1">
+      <w:start w:val="1"/>
+      <w:numFmt w:val="decimal"/>
+      <w:lvlText w:val="%7."/>
+      <w:lvlJc w:val="left"/>
+      <w:pPr>
+        <w:ind w:left="5040" w:hanging="360"/>
+      </w:pPr>
+    </w:lvl>
+    <w:lvl w:ilvl="7" w:tplc="0C090019" w:tentative="1">
+      <w:start w:val="1"/>
+      <w:numFmt w:val="lowerLetter"/>
+      <w:lvlText w:val="%8."/>
+      <w:lvlJc w:val="left"/>
+      <w:pPr>
+        <w:ind w:left="5760" w:hanging="360"/>
+      </w:pPr>
+    </w:lvl>
+    <w:lvl w:ilvl="8" w:tplc="0C09001B" w:tentative="1">
+      <w:start w:val="1"/>
+      <w:numFmt w:val="lowerRoman"/>
+      <w:lvlText w:val="%9."/>
+      <w:lvlJc w:val="right"/>
+      <w:pPr>
+        <w:ind w:left="6480" w:hanging="180"/>
+      </w:pPr>
+    </w:lvl>
+  </w:abstractNum>
+  <w:abstractNum w:abstractNumId="9" w15:restartNumberingAfterBreak="0">
     <w:nsid w:val="1FB52B5E"/>
     <w:multiLevelType w:val="multilevel"/>
     <w:tmpl w:val="62689B10"/>
@@ -24953,7 +26595,7 @@
       </w:rPr>
     </w:lvl>
   </w:abstractNum>
-  <w:abstractNum w:abstractNumId="8" w15:restartNumberingAfterBreak="0">
+  <w:abstractNum w:abstractNumId="10" w15:restartNumberingAfterBreak="0">
     <w:nsid w:val="20CE428F"/>
     <w:multiLevelType w:val="hybridMultilevel"/>
     <w:tmpl w:val="048001A0"/>
@@ -25043,7 +26685,7 @@
       </w:pPr>
     </w:lvl>
   </w:abstractNum>
-  <w:abstractNum w:abstractNumId="9" w15:restartNumberingAfterBreak="0">
+  <w:abstractNum w:abstractNumId="11" w15:restartNumberingAfterBreak="0">
     <w:nsid w:val="25834A2D"/>
     <w:multiLevelType w:val="multilevel"/>
     <w:tmpl w:val="E91694EC"/>
@@ -25157,7 +26799,7 @@
       </w:rPr>
     </w:lvl>
   </w:abstractNum>
-  <w:abstractNum w:abstractNumId="10" w15:restartNumberingAfterBreak="0">
+  <w:abstractNum w:abstractNumId="12" w15:restartNumberingAfterBreak="0">
     <w:nsid w:val="2BB45C6F"/>
     <w:multiLevelType w:val="hybridMultilevel"/>
     <w:tmpl w:val="BCE06DAE"/>
@@ -25243,7 +26885,7 @@
       </w:pPr>
     </w:lvl>
   </w:abstractNum>
-  <w:abstractNum w:abstractNumId="11" w15:restartNumberingAfterBreak="0">
+  <w:abstractNum w:abstractNumId="13" w15:restartNumberingAfterBreak="0">
     <w:nsid w:val="323024FC"/>
     <w:multiLevelType w:val="multilevel"/>
     <w:tmpl w:val="0CBAADA6"/>
@@ -25360,7 +27002,7 @@
       </w:rPr>
     </w:lvl>
   </w:abstractNum>
-  <w:abstractNum w:abstractNumId="12" w15:restartNumberingAfterBreak="0">
+  <w:abstractNum w:abstractNumId="14" w15:restartNumberingAfterBreak="0">
     <w:nsid w:val="347C285E"/>
     <w:multiLevelType w:val="hybridMultilevel"/>
     <w:tmpl w:val="D540BA4E"/>
@@ -25473,7 +27115,7 @@
       </w:rPr>
     </w:lvl>
   </w:abstractNum>
-  <w:abstractNum w:abstractNumId="13" w15:restartNumberingAfterBreak="0">
+  <w:abstractNum w:abstractNumId="15" w15:restartNumberingAfterBreak="0">
     <w:nsid w:val="36FC2B1F"/>
     <w:multiLevelType w:val="hybridMultilevel"/>
     <w:tmpl w:val="C81C525A"/>
@@ -25567,7 +27209,7 @@
       </w:pPr>
     </w:lvl>
   </w:abstractNum>
-  <w:abstractNum w:abstractNumId="14" w15:restartNumberingAfterBreak="0">
+  <w:abstractNum w:abstractNumId="16" w15:restartNumberingAfterBreak="0">
     <w:nsid w:val="39082113"/>
     <w:multiLevelType w:val="multilevel"/>
     <w:tmpl w:val="F85C8D5A"/>
@@ -25684,7 +27326,7 @@
       </w:rPr>
     </w:lvl>
   </w:abstractNum>
-  <w:abstractNum w:abstractNumId="15" w15:restartNumberingAfterBreak="0">
+  <w:abstractNum w:abstractNumId="17" w15:restartNumberingAfterBreak="0">
     <w:nsid w:val="3AD77EDF"/>
     <w:multiLevelType w:val="hybridMultilevel"/>
     <w:tmpl w:val="C81C525A"/>
@@ -25778,7 +27420,7 @@
       </w:pPr>
     </w:lvl>
   </w:abstractNum>
-  <w:abstractNum w:abstractNumId="16" w15:restartNumberingAfterBreak="0">
+  <w:abstractNum w:abstractNumId="18" w15:restartNumberingAfterBreak="0">
     <w:nsid w:val="3E935308"/>
     <w:multiLevelType w:val="hybridMultilevel"/>
     <w:tmpl w:val="BCE06DAE"/>
@@ -25864,7 +27506,7 @@
       </w:pPr>
     </w:lvl>
   </w:abstractNum>
-  <w:abstractNum w:abstractNumId="17" w15:restartNumberingAfterBreak="0">
+  <w:abstractNum w:abstractNumId="19" w15:restartNumberingAfterBreak="0">
     <w:nsid w:val="42782765"/>
     <w:multiLevelType w:val="hybridMultilevel"/>
     <w:tmpl w:val="90884394"/>
@@ -25981,7 +27623,7 @@
       </w:rPr>
     </w:lvl>
   </w:abstractNum>
-  <w:abstractNum w:abstractNumId="18" w15:restartNumberingAfterBreak="0">
+  <w:abstractNum w:abstractNumId="20" w15:restartNumberingAfterBreak="0">
     <w:nsid w:val="440F3383"/>
     <w:multiLevelType w:val="hybridMultilevel"/>
     <w:tmpl w:val="0DCEEC8E"/>
@@ -26067,7 +27709,7 @@
       </w:pPr>
     </w:lvl>
   </w:abstractNum>
-  <w:abstractNum w:abstractNumId="19" w15:restartNumberingAfterBreak="0">
+  <w:abstractNum w:abstractNumId="21" w15:restartNumberingAfterBreak="0">
     <w:nsid w:val="49311F88"/>
     <w:multiLevelType w:val="hybridMultilevel"/>
     <w:tmpl w:val="CBD40E4A"/>
@@ -26153,7 +27795,7 @@
       </w:pPr>
     </w:lvl>
   </w:abstractNum>
-  <w:abstractNum w:abstractNumId="20" w15:restartNumberingAfterBreak="0">
+  <w:abstractNum w:abstractNumId="22" w15:restartNumberingAfterBreak="0">
     <w:nsid w:val="4A6244C1"/>
     <w:multiLevelType w:val="hybridMultilevel"/>
     <w:tmpl w:val="C4DCDB3C"/>
@@ -26266,7 +27908,7 @@
       </w:rPr>
     </w:lvl>
   </w:abstractNum>
-  <w:abstractNum w:abstractNumId="21" w15:restartNumberingAfterBreak="0">
+  <w:abstractNum w:abstractNumId="23" w15:restartNumberingAfterBreak="0">
     <w:nsid w:val="4E5B4457"/>
     <w:multiLevelType w:val="hybridMultilevel"/>
     <w:tmpl w:val="B16E5072"/>
@@ -26379,7 +28021,7 @@
       </w:rPr>
     </w:lvl>
   </w:abstractNum>
-  <w:abstractNum w:abstractNumId="22" w15:restartNumberingAfterBreak="0">
+  <w:abstractNum w:abstractNumId="24" w15:restartNumberingAfterBreak="0">
     <w:nsid w:val="52152DC1"/>
     <w:multiLevelType w:val="hybridMultilevel"/>
     <w:tmpl w:val="163EAA66"/>
@@ -26468,7 +28110,7 @@
       </w:pPr>
     </w:lvl>
   </w:abstractNum>
-  <w:abstractNum w:abstractNumId="23" w15:restartNumberingAfterBreak="0">
+  <w:abstractNum w:abstractNumId="25" w15:restartNumberingAfterBreak="0">
     <w:nsid w:val="52D877BD"/>
     <w:multiLevelType w:val="hybridMultilevel"/>
     <w:tmpl w:val="091CD6A4"/>
@@ -26558,7 +28200,7 @@
       </w:pPr>
     </w:lvl>
   </w:abstractNum>
-  <w:abstractNum w:abstractNumId="24" w15:restartNumberingAfterBreak="0">
+  <w:abstractNum w:abstractNumId="26" w15:restartNumberingAfterBreak="0">
     <w:nsid w:val="536179CA"/>
     <w:multiLevelType w:val="hybridMultilevel"/>
     <w:tmpl w:val="8ADC7E04"/>
@@ -26648,7 +28290,7 @@
       </w:pPr>
     </w:lvl>
   </w:abstractNum>
-  <w:abstractNum w:abstractNumId="25" w15:restartNumberingAfterBreak="0">
+  <w:abstractNum w:abstractNumId="27" w15:restartNumberingAfterBreak="0">
     <w:nsid w:val="53BE6AB0"/>
     <w:multiLevelType w:val="multilevel"/>
     <w:tmpl w:val="33C444A6"/>
@@ -26765,7 +28407,7 @@
       </w:rPr>
     </w:lvl>
   </w:abstractNum>
-  <w:abstractNum w:abstractNumId="26" w15:restartNumberingAfterBreak="0">
+  <w:abstractNum w:abstractNumId="28" w15:restartNumberingAfterBreak="0">
     <w:nsid w:val="5754766F"/>
     <w:multiLevelType w:val="multilevel"/>
     <w:tmpl w:val="72DAA2BE"/>
@@ -26885,7 +28527,7 @@
       </w:rPr>
     </w:lvl>
   </w:abstractNum>
-  <w:abstractNum w:abstractNumId="27" w15:restartNumberingAfterBreak="0">
+  <w:abstractNum w:abstractNumId="29" w15:restartNumberingAfterBreak="0">
     <w:nsid w:val="593C0AE7"/>
     <w:multiLevelType w:val="multilevel"/>
     <w:tmpl w:val="0DCCB346"/>
@@ -27002,7 +28644,7 @@
       </w:rPr>
     </w:lvl>
   </w:abstractNum>
-  <w:abstractNum w:abstractNumId="28" w15:restartNumberingAfterBreak="0">
+  <w:abstractNum w:abstractNumId="30" w15:restartNumberingAfterBreak="0">
     <w:nsid w:val="593E7447"/>
     <w:multiLevelType w:val="hybridMultilevel"/>
     <w:tmpl w:val="8C4809A0"/>
@@ -27116,7 +28758,7 @@
       </w:rPr>
     </w:lvl>
   </w:abstractNum>
-  <w:abstractNum w:abstractNumId="29" w15:restartNumberingAfterBreak="0">
+  <w:abstractNum w:abstractNumId="31" w15:restartNumberingAfterBreak="0">
     <w:nsid w:val="5B6F6927"/>
     <w:multiLevelType w:val="multilevel"/>
     <w:tmpl w:val="BA2480B2"/>
@@ -27230,7 +28872,7 @@
       </w:rPr>
     </w:lvl>
   </w:abstractNum>
-  <w:abstractNum w:abstractNumId="30" w15:restartNumberingAfterBreak="0">
+  <w:abstractNum w:abstractNumId="32" w15:restartNumberingAfterBreak="0">
     <w:nsid w:val="640F6508"/>
     <w:multiLevelType w:val="multilevel"/>
     <w:tmpl w:val="40848AA0"/>
@@ -27320,7 +28962,7 @@
       </w:pPr>
     </w:lvl>
   </w:abstractNum>
-  <w:abstractNum w:abstractNumId="31" w15:restartNumberingAfterBreak="0">
+  <w:abstractNum w:abstractNumId="33" w15:restartNumberingAfterBreak="0">
     <w:nsid w:val="701D5662"/>
     <w:multiLevelType w:val="hybridMultilevel"/>
     <w:tmpl w:val="8A9ACF1C"/>
@@ -27433,7 +29075,7 @@
       </w:rPr>
     </w:lvl>
   </w:abstractNum>
-  <w:abstractNum w:abstractNumId="32" w15:restartNumberingAfterBreak="0">
+  <w:abstractNum w:abstractNumId="34" w15:restartNumberingAfterBreak="0">
     <w:nsid w:val="750D332F"/>
     <w:multiLevelType w:val="multilevel"/>
     <w:tmpl w:val="0809001D"/>
@@ -27520,7 +29162,7 @@
       </w:pPr>
     </w:lvl>
   </w:abstractNum>
-  <w:abstractNum w:abstractNumId="33" w15:restartNumberingAfterBreak="0">
+  <w:abstractNum w:abstractNumId="35" w15:restartNumberingAfterBreak="0">
     <w:nsid w:val="76E751BB"/>
     <w:multiLevelType w:val="hybridMultilevel"/>
     <w:tmpl w:val="163EAA66"/>
@@ -27609,7 +29251,7 @@
       </w:pPr>
     </w:lvl>
   </w:abstractNum>
-  <w:abstractNum w:abstractNumId="34" w15:restartNumberingAfterBreak="0">
+  <w:abstractNum w:abstractNumId="36" w15:restartNumberingAfterBreak="0">
     <w:nsid w:val="77F70F51"/>
     <w:multiLevelType w:val="hybridMultilevel"/>
     <w:tmpl w:val="FCB8B5FA"/>
@@ -27698,7 +29340,121 @@
       </w:pPr>
     </w:lvl>
   </w:abstractNum>
-  <w:abstractNum w:abstractNumId="35" w15:restartNumberingAfterBreak="0">
+  <w:abstractNum w:abstractNumId="37" w15:restartNumberingAfterBreak="0">
+    <w:nsid w:val="799E7322"/>
+    <w:multiLevelType w:val="hybridMultilevel"/>
+    <w:tmpl w:val="3C7E16F4"/>
+    <w:lvl w:ilvl="0" w:tplc="06540A5A">
+      <w:start w:val="1"/>
+      <w:numFmt w:val="decimal"/>
+      <w:lvlText w:val="%1."/>
+      <w:lvlJc w:val="left"/>
+      <w:pPr>
+        <w:ind w:left="720" w:hanging="360"/>
+      </w:pPr>
+      <w:rPr>
+        <w:rFonts w:hint="default"/>
+        <w:b w:val="0"/>
+      </w:rPr>
+    </w:lvl>
+    <w:lvl w:ilvl="1" w:tplc="0C090003">
+      <w:start w:val="1"/>
+      <w:numFmt w:val="bullet"/>
+      <w:lvlText w:val="o"/>
+      <w:lvlJc w:val="left"/>
+      <w:pPr>
+        <w:ind w:left="1440" w:hanging="360"/>
+      </w:pPr>
+      <w:rPr>
+        <w:rFonts w:ascii="Courier New" w:hAnsi="Courier New" w:cs="Courier New" w:hint="default"/>
+      </w:rPr>
+    </w:lvl>
+    <w:lvl w:ilvl="2" w:tplc="0C090005" w:tentative="1">
+      <w:start w:val="1"/>
+      <w:numFmt w:val="bullet"/>
+      <w:lvlText w:val=""/>
+      <w:lvlJc w:val="left"/>
+      <w:pPr>
+        <w:ind w:left="2160" w:hanging="360"/>
+      </w:pPr>
+      <w:rPr>
+        <w:rFonts w:ascii="Wingdings" w:hAnsi="Wingdings" w:hint="default"/>
+      </w:rPr>
+    </w:lvl>
+    <w:lvl w:ilvl="3" w:tplc="0C090001" w:tentative="1">
+      <w:start w:val="1"/>
+      <w:numFmt w:val="bullet"/>
+      <w:lvlText w:val=""/>
+      <w:lvlJc w:val="left"/>
+      <w:pPr>
+        <w:ind w:left="2880" w:hanging="360"/>
+      </w:pPr>
+      <w:rPr>
+        <w:rFonts w:ascii="Symbol" w:hAnsi="Symbol" w:hint="default"/>
+      </w:rPr>
+    </w:lvl>
+    <w:lvl w:ilvl="4" w:tplc="0C090003" w:tentative="1">
+      <w:start w:val="1"/>
+      <w:numFmt w:val="bullet"/>
+      <w:lvlText w:val="o"/>
+      <w:lvlJc w:val="left"/>
+      <w:pPr>
+        <w:ind w:left="3600" w:hanging="360"/>
+      </w:pPr>
+      <w:rPr>
+        <w:rFonts w:ascii="Courier New" w:hAnsi="Courier New" w:cs="Courier New" w:hint="default"/>
+      </w:rPr>
+    </w:lvl>
+    <w:lvl w:ilvl="5" w:tplc="0C090005" w:tentative="1">
+      <w:start w:val="1"/>
+      <w:numFmt w:val="bullet"/>
+      <w:lvlText w:val=""/>
+      <w:lvlJc w:val="left"/>
+      <w:pPr>
+        <w:ind w:left="4320" w:hanging="360"/>
+      </w:pPr>
+      <w:rPr>
+        <w:rFonts w:ascii="Wingdings" w:hAnsi="Wingdings" w:hint="default"/>
+      </w:rPr>
+    </w:lvl>
+    <w:lvl w:ilvl="6" w:tplc="0C090001" w:tentative="1">
+      <w:start w:val="1"/>
+      <w:numFmt w:val="bullet"/>
+      <w:lvlText w:val=""/>
+      <w:lvlJc w:val="left"/>
+      <w:pPr>
+        <w:ind w:left="5040" w:hanging="360"/>
+      </w:pPr>
+      <w:rPr>
+        <w:rFonts w:ascii="Symbol" w:hAnsi="Symbol" w:hint="default"/>
+      </w:rPr>
+    </w:lvl>
+    <w:lvl w:ilvl="7" w:tplc="0C090003" w:tentative="1">
+      <w:start w:val="1"/>
+      <w:numFmt w:val="bullet"/>
+      <w:lvlText w:val="o"/>
+      <w:lvlJc w:val="left"/>
+      <w:pPr>
+        <w:ind w:left="5760" w:hanging="360"/>
+      </w:pPr>
+      <w:rPr>
+        <w:rFonts w:ascii="Courier New" w:hAnsi="Courier New" w:cs="Courier New" w:hint="default"/>
+      </w:rPr>
+    </w:lvl>
+    <w:lvl w:ilvl="8" w:tplc="0C090005" w:tentative="1">
+      <w:start w:val="1"/>
+      <w:numFmt w:val="bullet"/>
+      <w:lvlText w:val=""/>
+      <w:lvlJc w:val="left"/>
+      <w:pPr>
+        <w:ind w:left="6480" w:hanging="360"/>
+      </w:pPr>
+      <w:rPr>
+        <w:rFonts w:ascii="Wingdings" w:hAnsi="Wingdings" w:hint="default"/>
+      </w:rPr>
+    </w:lvl>
+  </w:abstractNum>
+  <w:abstractNum w:abstractNumId="38" w15:restartNumberingAfterBreak="0">
     <w:nsid w:val="7AF7375F"/>
     <w:multiLevelType w:val="hybridMultilevel"/>
     <w:tmpl w:val="CB10BE82"/>
@@ -27811,7 +29567,7 @@
       </w:rPr>
     </w:lvl>
   </w:abstractNum>
-  <w:abstractNum w:abstractNumId="36" w15:restartNumberingAfterBreak="0">
+  <w:abstractNum w:abstractNumId="39" w15:restartNumberingAfterBreak="0">
     <w:nsid w:val="7C3B2ECD"/>
     <w:multiLevelType w:val="hybridMultilevel"/>
     <w:tmpl w:val="5D260198"/>
@@ -27898,73 +29654,73 @@
     </w:lvl>
   </w:abstractNum>
   <w:num w:numId="1">
-    <w:abstractNumId w:val="28"/>
+    <w:abstractNumId w:val="30"/>
   </w:num>
   <w:num w:numId="2">
-    <w:abstractNumId w:val="8"/>
+    <w:abstractNumId w:val="10"/>
   </w:num>
   <w:num w:numId="3">
     <w:abstractNumId w:val="0"/>
   </w:num>
   <w:num w:numId="4">
-    <w:abstractNumId w:val="25"/>
+    <w:abstractNumId w:val="27"/>
   </w:num>
   <w:num w:numId="5">
-    <w:abstractNumId w:val="17"/>
+    <w:abstractNumId w:val="19"/>
   </w:num>
   <w:num w:numId="6">
-    <w:abstractNumId w:val="11"/>
+    <w:abstractNumId w:val="13"/>
   </w:num>
   <w:num w:numId="7">
+    <w:abstractNumId w:val="31"/>
+  </w:num>
+  <w:num w:numId="8">
+    <w:abstractNumId w:val="16"/>
+  </w:num>
+  <w:num w:numId="9">
+    <w:abstractNumId w:val="26"/>
+  </w:num>
+  <w:num w:numId="10">
+    <w:abstractNumId w:val="32"/>
+  </w:num>
+  <w:num w:numId="11">
+    <w:abstractNumId w:val="9"/>
+  </w:num>
+  <w:num w:numId="12">
     <w:abstractNumId w:val="29"/>
   </w:num>
-  <w:num w:numId="8">
-    <w:abstractNumId w:val="14"/>
-  </w:num>
-  <w:num w:numId="9">
-    <w:abstractNumId w:val="24"/>
-  </w:num>
-  <w:num w:numId="10">
-    <w:abstractNumId w:val="30"/>
-  </w:num>
-  <w:num w:numId="11">
-    <w:abstractNumId w:val="7"/>
-  </w:num>
-  <w:num w:numId="12">
-    <w:abstractNumId w:val="27"/>
-  </w:num>
   <w:num w:numId="13">
-    <w:abstractNumId w:val="9"/>
+    <w:abstractNumId w:val="11"/>
   </w:num>
   <w:num w:numId="14">
     <w:abstractNumId w:val="1"/>
   </w:num>
   <w:num w:numId="15">
-    <w:abstractNumId w:val="26"/>
+    <w:abstractNumId w:val="28"/>
   </w:num>
   <w:num w:numId="16">
     <w:abstractNumId w:val="5"/>
   </w:num>
   <w:num w:numId="17">
-    <w:abstractNumId w:val="32"/>
+    <w:abstractNumId w:val="34"/>
   </w:num>
   <w:num w:numId="18">
-    <w:abstractNumId w:val="21"/>
+    <w:abstractNumId w:val="23"/>
   </w:num>
   <w:num w:numId="19">
-    <w:abstractNumId w:val="15"/>
+    <w:abstractNumId w:val="17"/>
   </w:num>
   <w:num w:numId="20">
-    <w:abstractNumId w:val="31"/>
+    <w:abstractNumId w:val="33"/>
   </w:num>
   <w:num w:numId="21">
     <w:abstractNumId w:val="2"/>
   </w:num>
   <w:num w:numId="22">
-    <w:abstractNumId w:val="13"/>
+    <w:abstractNumId w:val="15"/>
   </w:num>
   <w:num w:numId="23">
-    <w:abstractNumId w:val="23"/>
+    <w:abstractNumId w:val="25"/>
     <w:lvlOverride w:ilvl="0">
       <w:startOverride w:val="1"/>
     </w:lvlOverride>
@@ -27994,46 +29750,55 @@
     </w:lvlOverride>
   </w:num>
   <w:num w:numId="24">
-    <w:abstractNumId w:val="16"/>
+    <w:abstractNumId w:val="18"/>
   </w:num>
   <w:num w:numId="25">
-    <w:abstractNumId w:val="18"/>
+    <w:abstractNumId w:val="20"/>
   </w:num>
   <w:num w:numId="26">
-    <w:abstractNumId w:val="10"/>
+    <w:abstractNumId w:val="12"/>
   </w:num>
   <w:num w:numId="27">
-    <w:abstractNumId w:val="19"/>
+    <w:abstractNumId w:val="21"/>
   </w:num>
   <w:num w:numId="28">
     <w:abstractNumId w:val="3"/>
   </w:num>
   <w:num w:numId="29">
+    <w:abstractNumId w:val="39"/>
+  </w:num>
+  <w:num w:numId="30">
+    <w:abstractNumId w:val="7"/>
+  </w:num>
+  <w:num w:numId="31">
     <w:abstractNumId w:val="36"/>
   </w:num>
-  <w:num w:numId="30">
-    <w:abstractNumId w:val="6"/>
-  </w:num>
-  <w:num w:numId="31">
-    <w:abstractNumId w:val="34"/>
-  </w:num>
   <w:num w:numId="32">
-    <w:abstractNumId w:val="12"/>
+    <w:abstractNumId w:val="14"/>
   </w:num>
   <w:num w:numId="33">
-    <w:abstractNumId w:val="35"/>
+    <w:abstractNumId w:val="38"/>
   </w:num>
   <w:num w:numId="34">
     <w:abstractNumId w:val="4"/>
   </w:num>
   <w:num w:numId="35">
+    <w:abstractNumId w:val="24"/>
+  </w:num>
+  <w:num w:numId="36">
+    <w:abstractNumId w:val="35"/>
+  </w:num>
+  <w:num w:numId="37">
     <w:abstractNumId w:val="22"/>
   </w:num>
-  <w:num w:numId="36">
-    <w:abstractNumId w:val="33"/>
+  <w:num w:numId="38">
+    <w:abstractNumId w:val="6"/>
   </w:num>
-  <w:num w:numId="37">
-    <w:abstractNumId w:val="20"/>
+  <w:num w:numId="39">
+    <w:abstractNumId w:val="37"/>
+  </w:num>
+  <w:num w:numId="40">
+    <w:abstractNumId w:val="8"/>
   </w:num>
   <w:numIdMacAtCleanup w:val="37"/>
 </w:numbering>
@@ -30640,6 +32405,8 @@
     <w:rsid w:val="00D14C53"/>
     <w:rsid w:val="00DE272A"/>
     <w:rsid w:val="00DE6AFD"/>
+    <w:rsid w:val="00EF7AA1"/>
+    <w:rsid w:val="00F2402C"/>
     <w:rsid w:val="00F61185"/>
     <w:rsid w:val="00FE47C3"/>
   </w:rsids>
@@ -31432,6 +33199,15 @@
 </file>
 
 <file path=customXml/item1.xml><?xml version="1.0" encoding="utf-8"?>
+<?mso-contentType ?>
+<FormTemplates xmlns="http://schemas.microsoft.com/sharepoint/v3/contenttype/forms">
+  <Display>DocumentLibraryForm</Display>
+  <Edit>DocumentLibraryForm</Edit>
+  <New>DocumentLibraryForm</New>
+</FormTemplates>
+</file>
+
+<file path=customXml/item2.xml><?xml version="1.0" encoding="utf-8"?>
 <p:properties xmlns:p="http://schemas.microsoft.com/office/2006/metadata/properties" xmlns:xsi="http://www.w3.org/2001/XMLSchema-instance" xmlns:pc="http://schemas.microsoft.com/office/infopath/2007/PartnerControls">
   <documentManagement>
     <_activity xmlns="fc400f29-8ae2-4f02-aa36-8354319d8dd0" xsi:nil="true"/>
@@ -31439,7 +33215,7 @@
 </p:properties>
 </file>
 
-<file path=customXml/item2.xml><?xml version="1.0" encoding="utf-8"?>
+<file path=customXml/item3.xml><?xml version="1.0" encoding="utf-8"?>
 <ct:contentTypeSchema xmlns:ct="http://schemas.microsoft.com/office/2006/metadata/contentType" xmlns:ma="http://schemas.microsoft.com/office/2006/metadata/properties/metaAttributes" ct:_="" ma:_="" ma:contentTypeName="Document" ma:contentTypeID="0x0101002FED5117B94A0C43BE657CFE95077C6E" ma:contentTypeVersion="17" ma:contentTypeDescription="Create a new document." ma:contentTypeScope="" ma:versionID="1b61ef74c0cf3f1787575cceeb5049c4">
   <xsd:schema xmlns:xsd="http://www.w3.org/2001/XMLSchema" xmlns:xs="http://www.w3.org/2001/XMLSchema" xmlns:p="http://schemas.microsoft.com/office/2006/metadata/properties" xmlns:ns3="fc400f29-8ae2-4f02-aa36-8354319d8dd0" xmlns:ns4="a53e46f7-009c-4700-bfb1-03be8983c549" targetNamespace="http://schemas.microsoft.com/office/2006/metadata/properties" ma:root="true" ma:fieldsID="a097de4b958cf184ce63d565c2177212" ns3:_="" ns4:_="">
     <xsd:import namespace="fc400f29-8ae2-4f02-aa36-8354319d8dd0"/>
@@ -31686,20 +33462,19 @@
 </ct:contentTypeSchema>
 </file>
 
-<file path=customXml/item3.xml><?xml version="1.0" encoding="utf-8"?>
-<?mso-contentType ?>
-<FormTemplates xmlns="http://schemas.microsoft.com/sharepoint/v3/contenttype/forms">
-  <Display>DocumentLibraryForm</Display>
-  <Edit>DocumentLibraryForm</Edit>
-  <New>DocumentLibraryForm</New>
-</FormTemplates>
-</file>
-
 <file path=customXml/item4.xml><?xml version="1.0" encoding="utf-8"?>
 <b:Sources xmlns:b="http://schemas.openxmlformats.org/officeDocument/2006/bibliography" xmlns="http://schemas.openxmlformats.org/officeDocument/2006/bibliography" SelectedStyle="\APASixthEditionOfficeOnline.xsl" StyleName="APA" Version="6"/>
 </file>
 
 <file path=customXml/itemProps1.xml><?xml version="1.0" encoding="utf-8"?>
+<ds:datastoreItem xmlns:ds="http://schemas.openxmlformats.org/officeDocument/2006/customXml" ds:itemID="{E3499DD3-E433-4477-A8FE-2A9B10275570}">
+  <ds:schemaRefs>
+    <ds:schemaRef ds:uri="http://schemas.microsoft.com/sharepoint/v3/contenttype/forms"/>
+  </ds:schemaRefs>
+</ds:datastoreItem>
+</file>
+
+<file path=customXml/itemProps2.xml><?xml version="1.0" encoding="utf-8"?>
 <ds:datastoreItem xmlns:ds="http://schemas.openxmlformats.org/officeDocument/2006/customXml" ds:itemID="{3A0AC818-964C-4D39-B25F-D98F3F83829C}">
   <ds:schemaRefs>
     <ds:schemaRef ds:uri="http://schemas.microsoft.com/office/2006/metadata/properties"/>
@@ -31709,7 +33484,7 @@
 </ds:datastoreItem>
 </file>
 
-<file path=customXml/itemProps2.xml><?xml version="1.0" encoding="utf-8"?>
+<file path=customXml/itemProps3.xml><?xml version="1.0" encoding="utf-8"?>
 <ds:datastoreItem xmlns:ds="http://schemas.openxmlformats.org/officeDocument/2006/customXml" ds:itemID="{B6942B79-D663-4AEC-A309-D8E420D7B2CD}">
   <ds:schemaRefs>
     <ds:schemaRef ds:uri="http://schemas.microsoft.com/office/2006/metadata/contentType"/>
@@ -31728,16 +33503,8 @@
 </ds:datastoreItem>
 </file>
 
-<file path=customXml/itemProps3.xml><?xml version="1.0" encoding="utf-8"?>
-<ds:datastoreItem xmlns:ds="http://schemas.openxmlformats.org/officeDocument/2006/customXml" ds:itemID="{E3499DD3-E433-4477-A8FE-2A9B10275570}">
-  <ds:schemaRefs>
-    <ds:schemaRef ds:uri="http://schemas.microsoft.com/sharepoint/v3/contenttype/forms"/>
-  </ds:schemaRefs>
-</ds:datastoreItem>
-</file>
-
 <file path=customXml/itemProps4.xml><?xml version="1.0" encoding="utf-8"?>
-<ds:datastoreItem xmlns:ds="http://schemas.openxmlformats.org/officeDocument/2006/customXml" ds:itemID="{E178D4CE-8A26-447E-93E0-B03F3D386621}">
+<ds:datastoreItem xmlns:ds="http://schemas.openxmlformats.org/officeDocument/2006/customXml" ds:itemID="{67046218-90C2-4824-AE37-B2F60DAEA4FE}">
   <ds:schemaRefs>
     <ds:schemaRef ds:uri="http://schemas.openxmlformats.org/officeDocument/2006/bibliography"/>
   </ds:schemaRefs>

</xml_diff>